<commit_message>
docs: đặt danh mục công trình khoa học sau Kết luận, trước Tài liệu tham khảo
</commit_message>
<xml_diff>
--- a/docs/BAO_CAO_THUC_TAP.docx
+++ b/docs/BAO_CAO_THUC_TAP.docx
@@ -2530,1328 +2530,812 @@
     <w:p>
       <w:pPr>
         <w:pStyle w:val="Heading1N"/>
-        <w:keepNext/>
         <w:pageBreakBefore/>
         <w:ind w:left="0" w:firstLine="0"/>
         <w:jc w:val="center"/>
       </w:pPr>
       <w:r>
+        <w:t xml:space="preserve">MỤC LỤC</w:t>
+      </w:r>
+    </w:p>
+    <w:p>
+      <w:pPr>
+        <w:pStyle w:val="TOC1"/>
+      </w:pPr>
+      <w:r>
+        <w:fldChar w:fldCharType="begin"/>
+      </w:r>
+      <w:r>
+        <w:instrText xml:space="preserve"> TOC \o "1-2" \h \z \u </w:instrText>
+      </w:r>
+      <w:r>
+        <w:fldChar w:fldCharType="separate"/>
+      </w:r>
+      <w:r>
+        <w:t xml:space="preserve">THÔNG TIN CHUNG</w:t>
+      </w:r>
+      <w:r>
+        <w:tab/>
+      </w:r>
+      <w:r>
+        <w:t xml:space="preserve">i</w:t>
+      </w:r>
+    </w:p>
+    <w:p>
+      <w:pPr>
+        <w:pStyle w:val="TOC1"/>
+      </w:pPr>
+      <w:r>
+        <w:t xml:space="preserve">THÔNG TIN VỀ HỌC PHẦN THỰC TẬP TỐT NGHIỆP</w:t>
+      </w:r>
+      <w:r>
+        <w:tab/>
+      </w:r>
+      <w:r>
+        <w:t xml:space="preserve">ii</w:t>
+      </w:r>
+    </w:p>
+    <w:p>
+      <w:pPr>
+        <w:pStyle w:val="TOC1"/>
+      </w:pPr>
+      <w:r>
+        <w:t xml:space="preserve">LỜI CẢM ƠN</w:t>
+      </w:r>
+      <w:r>
+        <w:tab/>
+      </w:r>
+      <w:r>
+        <w:t xml:space="preserve">iv</w:t>
+      </w:r>
+    </w:p>
+    <w:p>
+      <w:pPr>
+        <w:pStyle w:val="TOC1"/>
+      </w:pPr>
+      <w:r>
+        <w:t xml:space="preserve">MỤC LỤC</w:t>
+      </w:r>
+      <w:r>
+        <w:tab/>
+      </w:r>
+      <w:r>
+        <w:t xml:space="preserve">v</w:t>
+      </w:r>
+    </w:p>
+    <w:p>
+      <w:pPr>
+        <w:pStyle w:val="TOC1"/>
+      </w:pPr>
+      <w:r>
+        <w:t xml:space="preserve">DANH MỤC BẢNG</w:t>
+      </w:r>
+      <w:r>
+        <w:tab/>
+      </w:r>
+      <w:r>
+        <w:t xml:space="preserve">vii</w:t>
+      </w:r>
+    </w:p>
+    <w:p>
+      <w:pPr>
+        <w:pStyle w:val="TOC1"/>
+      </w:pPr>
+      <w:r>
+        <w:t xml:space="preserve">DANH MỤC HÌNH</w:t>
+      </w:r>
+      <w:r>
+        <w:tab/>
+      </w:r>
+      <w:r>
+        <w:t xml:space="preserve">viii</w:t>
+      </w:r>
+    </w:p>
+    <w:p>
+      <w:pPr>
+        <w:pStyle w:val="TOC1"/>
+      </w:pPr>
+      <w:r>
+        <w:t xml:space="preserve">DANH MỤC TỪ VIẾT TẮT</w:t>
+      </w:r>
+      <w:r>
+        <w:tab/>
+      </w:r>
+      <w:r>
+        <w:t xml:space="preserve">ix</w:t>
+      </w:r>
+    </w:p>
+    <w:p>
+      <w:pPr>
+        <w:pStyle w:val="TOC1"/>
+      </w:pPr>
+      <w:r>
+        <w:t xml:space="preserve">TÓM TẮT</w:t>
+      </w:r>
+      <w:r>
+        <w:tab/>
+      </w:r>
+      <w:r>
+        <w:t xml:space="preserve">xi</w:t>
+      </w:r>
+    </w:p>
+    <w:p>
+      <w:pPr>
+        <w:pStyle w:val="TOC1"/>
+      </w:pPr>
+      <w:r>
+        <w:t xml:space="preserve">ABSTRACT</w:t>
+      </w:r>
+      <w:r>
+        <w:tab/>
+      </w:r>
+      <w:r>
+        <w:t xml:space="preserve">xii</w:t>
+      </w:r>
+    </w:p>
+    <w:p>
+      <w:pPr>
+        <w:pStyle w:val="TOC1"/>
+      </w:pPr>
+      <w:r>
+        <w:t xml:space="preserve">PHẦN 1 THÔNG TIN SINH VIÊN, CÔNG TY / ĐƠN VỊ THỰC TẬP, CÁN BỘ HƯỚNG DẪN, GIẢNG VIÊN, TRƯỜNG VÀ KHOA</w:t>
+      </w:r>
+      <w:r>
+        <w:tab/>
+      </w:r>
+      <w:r>
+        <w:t xml:space="preserve">1</w:t>
+      </w:r>
+    </w:p>
+    <w:p>
+      <w:pPr>
+        <w:pStyle w:val="TOC2"/>
+      </w:pPr>
+      <w:r>
+        <w:t xml:space="preserve">1.1</w:t>
+      </w:r>
+      <w:r>
+        <w:tab/>
+      </w:r>
+      <w:r>
+        <w:t xml:space="preserve">Thông tin sinh viên</w:t>
+      </w:r>
+      <w:r>
+        <w:tab/>
+      </w:r>
+      <w:r>
+        <w:t xml:space="preserve">1</w:t>
+      </w:r>
+    </w:p>
+    <w:p>
+      <w:pPr>
+        <w:pStyle w:val="TOC2"/>
+      </w:pPr>
+      <w:r>
+        <w:t xml:space="preserve">1.2</w:t>
+      </w:r>
+      <w:r>
+        <w:tab/>
+      </w:r>
+      <w:r>
+        <w:t xml:space="preserve">Thông tin công ty / đơn vị thực tập</w:t>
+      </w:r>
+      <w:r>
+        <w:tab/>
+      </w:r>
+      <w:r>
+        <w:t xml:space="preserve">1</w:t>
+      </w:r>
+    </w:p>
+    <w:p>
+      <w:pPr>
+        <w:pStyle w:val="TOC2"/>
+      </w:pPr>
+      <w:r>
+        <w:t xml:space="preserve">1.3</w:t>
+      </w:r>
+      <w:r>
+        <w:tab/>
+      </w:r>
+      <w:r>
+        <w:t xml:space="preserve">Thông tin Học viện Công nghệ Bưu chính Viễn thông</w:t>
+      </w:r>
+      <w:r>
+        <w:tab/>
+      </w:r>
+      <w:r>
+        <w:t xml:space="preserve">1</w:t>
+      </w:r>
+    </w:p>
+    <w:p>
+      <w:pPr>
+        <w:pStyle w:val="TOC2"/>
+      </w:pPr>
+      <w:r>
+        <w:t xml:space="preserve">1.4</w:t>
+      </w:r>
+      <w:r>
+        <w:tab/>
+      </w:r>
+      <w:r>
+        <w:t xml:space="preserve">Thông tin Khoa Công nghệ thông tin 1</w:t>
+      </w:r>
+      <w:r>
+        <w:tab/>
+      </w:r>
+      <w:r>
+        <w:t xml:space="preserve">2</w:t>
+      </w:r>
+    </w:p>
+    <w:p>
+      <w:pPr>
+        <w:pStyle w:val="TOC1"/>
+      </w:pPr>
+      <w:r>
+        <w:t xml:space="preserve">PHẦN 2 KẾ HOẠCH THỰC TẬP</w:t>
+      </w:r>
+      <w:r>
+        <w:tab/>
+      </w:r>
+      <w:r>
+        <w:t xml:space="preserve">3</w:t>
+      </w:r>
+    </w:p>
+    <w:p>
+      <w:pPr>
+        <w:pStyle w:val="TOC1"/>
+      </w:pPr>
+      <w:r>
+        <w:t xml:space="preserve">PHẦN 3 GIỚI THIỆU ĐƠN VỊ THỰC TẬP</w:t>
+      </w:r>
+      <w:r>
+        <w:tab/>
+      </w:r>
+      <w:r>
+        <w:t xml:space="preserve">6</w:t>
+      </w:r>
+    </w:p>
+    <w:p>
+      <w:pPr>
+        <w:pStyle w:val="TOC2"/>
+      </w:pPr>
+      <w:r>
+        <w:t xml:space="preserve">3.1</w:t>
+      </w:r>
+      <w:r>
+        <w:tab/>
+      </w:r>
+      <w:r>
+        <w:t xml:space="preserve">Thông tin doanh nghiệp</w:t>
+      </w:r>
+      <w:r>
+        <w:tab/>
+      </w:r>
+      <w:r>
+        <w:t xml:space="preserve">6</w:t>
+      </w:r>
+    </w:p>
+    <w:p>
+      <w:pPr>
+        <w:pStyle w:val="TOC2"/>
+      </w:pPr>
+      <w:r>
+        <w:t xml:space="preserve">3.2</w:t>
+      </w:r>
+      <w:r>
+        <w:tab/>
+      </w:r>
+      <w:r>
+        <w:t xml:space="preserve">Lịch sử hình thành và phát triển của doanh nghiệp</w:t>
+      </w:r>
+      <w:r>
+        <w:tab/>
+      </w:r>
+      <w:r>
+        <w:t xml:space="preserve">6</w:t>
+      </w:r>
+    </w:p>
+    <w:p>
+      <w:pPr>
+        <w:pStyle w:val="TOC2"/>
+      </w:pPr>
+      <w:r>
+        <w:t xml:space="preserve">3.3</w:t>
+      </w:r>
+      <w:r>
+        <w:tab/>
+      </w:r>
+      <w:r>
+        <w:t xml:space="preserve">Các lĩnh vực hoạt động, dịch vụ, hoặc sản phẩm của doanh nghiệp</w:t>
+      </w:r>
+      <w:r>
+        <w:tab/>
+      </w:r>
+      <w:r>
+        <w:t xml:space="preserve">7</w:t>
+      </w:r>
+    </w:p>
+    <w:p>
+      <w:pPr>
+        <w:pStyle w:val="TOC2"/>
+      </w:pPr>
+      <w:r>
+        <w:t xml:space="preserve">3.4</w:t>
+      </w:r>
+      <w:r>
+        <w:tab/>
+      </w:r>
+      <w:r>
+        <w:t xml:space="preserve">Những đóng góp của doanh nghiệp trong lĩnh vực chuyên môn</w:t>
+      </w:r>
+      <w:r>
+        <w:tab/>
+      </w:r>
+      <w:r>
+        <w:t xml:space="preserve">8</w:t>
+      </w:r>
+    </w:p>
+    <w:p>
+      <w:pPr>
+        <w:pStyle w:val="TOC2"/>
+      </w:pPr>
+      <w:r>
+        <w:t xml:space="preserve">3.5</w:t>
+      </w:r>
+      <w:r>
+        <w:tab/>
+      </w:r>
+      <w:r>
+        <w:t xml:space="preserve">Cơ cấu tổ chức và vị trí của sinh viên</w:t>
+      </w:r>
+      <w:r>
+        <w:tab/>
+      </w:r>
+      <w:r>
+        <w:t xml:space="preserve">9</w:t>
+      </w:r>
+    </w:p>
+    <w:p>
+      <w:pPr>
+        <w:pStyle w:val="TOC1"/>
+      </w:pPr>
+      <w:r>
+        <w:t xml:space="preserve">PHẦN 4 NHẬT KÝ THỰC TẬP</w:t>
+      </w:r>
+      <w:r>
+        <w:tab/>
+      </w:r>
+      <w:r>
+        <w:t xml:space="preserve">11</w:t>
+      </w:r>
+    </w:p>
+    <w:p>
+      <w:pPr>
+        <w:pStyle w:val="TOC2"/>
+      </w:pPr>
+      <w:r>
+        <w:tab/>
+      </w:r>
+      <w:r>
+        <w:t xml:space="preserve">Tuần 1 (từ ngày 29/06/2026 đến ngày 05/07/2026)</w:t>
+      </w:r>
+      <w:r>
+        <w:tab/>
+      </w:r>
+      <w:r>
+        <w:t xml:space="preserve">11</w:t>
+      </w:r>
+    </w:p>
+    <w:p>
+      <w:pPr>
+        <w:pStyle w:val="TOC2"/>
+      </w:pPr>
+      <w:r>
+        <w:tab/>
+      </w:r>
+      <w:r>
+        <w:t xml:space="preserve">Tuần 2 (từ ngày 06/07/2026 đến ngày 12/07/2026)</w:t>
+      </w:r>
+      <w:r>
+        <w:tab/>
+      </w:r>
+      <w:r>
+        <w:t xml:space="preserve">11</w:t>
+      </w:r>
+    </w:p>
+    <w:p>
+      <w:pPr>
+        <w:pStyle w:val="TOC2"/>
+      </w:pPr>
+      <w:r>
+        <w:tab/>
+      </w:r>
+      <w:r>
+        <w:t xml:space="preserve">Tuần 3 (từ ngày 13/07/2026 đến ngày 19/07/2026)</w:t>
+      </w:r>
+      <w:r>
+        <w:tab/>
+      </w:r>
+      <w:r>
+        <w:t xml:space="preserve">12</w:t>
+      </w:r>
+    </w:p>
+    <w:p>
+      <w:pPr>
+        <w:pStyle w:val="TOC2"/>
+      </w:pPr>
+      <w:r>
+        <w:tab/>
+      </w:r>
+      <w:r>
+        <w:t xml:space="preserve">Tuần 4 (từ ngày 20/07/2026 đến ngày 26/07/2026)</w:t>
+      </w:r>
+      <w:r>
+        <w:tab/>
+      </w:r>
+      <w:r>
+        <w:t xml:space="preserve">13</w:t>
+      </w:r>
+    </w:p>
+    <w:p>
+      <w:pPr>
+        <w:pStyle w:val="TOC2"/>
+      </w:pPr>
+      <w:r>
+        <w:tab/>
+      </w:r>
+      <w:r>
+        <w:t xml:space="preserve">Tuần 5 (từ ngày 27/07/2026 đến ngày 02/08/2026)</w:t>
+      </w:r>
+      <w:r>
+        <w:tab/>
+      </w:r>
+      <w:r>
+        <w:t xml:space="preserve">14</w:t>
+      </w:r>
+    </w:p>
+    <w:p>
+      <w:pPr>
+        <w:pStyle w:val="TOC2"/>
+      </w:pPr>
+      <w:r>
+        <w:tab/>
+      </w:r>
+      <w:r>
+        <w:t xml:space="preserve">Tuần 6 (từ ngày 03/08/2026 đến ngày 09/08/2026)</w:t>
+      </w:r>
+      <w:r>
+        <w:tab/>
+      </w:r>
+      <w:r>
+        <w:t xml:space="preserve">14</w:t>
+      </w:r>
+    </w:p>
+    <w:p>
+      <w:pPr>
+        <w:pStyle w:val="TOC2"/>
+      </w:pPr>
+      <w:r>
+        <w:tab/>
+      </w:r>
+      <w:r>
+        <w:t xml:space="preserve">Tuần 7 (từ ngày 10/08/2026 đến ngày 16/08/2026)</w:t>
+      </w:r>
+      <w:r>
+        <w:tab/>
+      </w:r>
+      <w:r>
+        <w:t xml:space="preserve">15</w:t>
+      </w:r>
+    </w:p>
+    <w:p>
+      <w:pPr>
+        <w:pStyle w:val="TOC2"/>
+      </w:pPr>
+      <w:r>
+        <w:tab/>
+      </w:r>
+      <w:r>
+        <w:t xml:space="preserve">Tuần 8 (từ ngày 17/08/2026 đến ngày 23/08/2026)</w:t>
+      </w:r>
+      <w:r>
+        <w:tab/>
+      </w:r>
+      <w:r>
+        <w:t xml:space="preserve">16</w:t>
+      </w:r>
+    </w:p>
+    <w:p>
+      <w:pPr>
+        <w:pStyle w:val="TOC2"/>
+      </w:pPr>
+      <w:r>
+        <w:tab/>
+      </w:r>
+      <w:r>
+        <w:t xml:space="preserve">Tuần 9 (từ ngày 24/08/2026 đến ngày 30/08/2026)</w:t>
+      </w:r>
+      <w:r>
+        <w:tab/>
+      </w:r>
+      <w:r>
+        <w:t xml:space="preserve">17</w:t>
+      </w:r>
+    </w:p>
+    <w:p>
+      <w:pPr>
+        <w:pStyle w:val="TOC2"/>
+      </w:pPr>
+      <w:r>
+        <w:tab/>
+      </w:r>
+      <w:r>
+        <w:t xml:space="preserve">Tuần 10 (từ ngày 31/08/2026 đến ngày 06/09/2026)</w:t>
+      </w:r>
+      <w:r>
+        <w:tab/>
+      </w:r>
+      <w:r>
+        <w:t xml:space="preserve">17</w:t>
+      </w:r>
+    </w:p>
+    <w:p>
+      <w:pPr>
+        <w:pStyle w:val="TOC2"/>
+      </w:pPr>
+      <w:r>
+        <w:tab/>
+      </w:r>
+      <w:r>
+        <w:t xml:space="preserve">Tuần 11 (từ ngày 07/09/2026 đến ngày 13/09/2026)</w:t>
+      </w:r>
+      <w:r>
+        <w:tab/>
+      </w:r>
+      <w:r>
+        <w:t xml:space="preserve">18</w:t>
+      </w:r>
+    </w:p>
+    <w:p>
+      <w:pPr>
+        <w:pStyle w:val="TOC2"/>
+      </w:pPr>
+      <w:r>
+        <w:tab/>
+      </w:r>
+      <w:r>
+        <w:t xml:space="preserve">Tuần 12 (từ ngày 14/09/2026 đến ngày 20/09/2026)</w:t>
+      </w:r>
+      <w:r>
+        <w:tab/>
+      </w:r>
+      <w:r>
+        <w:t xml:space="preserve">19</w:t>
+      </w:r>
+    </w:p>
+    <w:p>
+      <w:pPr>
+        <w:pStyle w:val="TOC2"/>
+      </w:pPr>
+      <w:r>
+        <w:tab/>
+      </w:r>
+      <w:r>
+        <w:t xml:space="preserve">Tuần 13 (từ ngày 21/09/2026 đến ngày 27/09/2026)</w:t>
+      </w:r>
+      <w:r>
+        <w:tab/>
+      </w:r>
+      <w:r>
+        <w:t xml:space="preserve">20</w:t>
+      </w:r>
+    </w:p>
+    <w:p>
+      <w:pPr>
+        <w:pStyle w:val="TOC1"/>
+      </w:pPr>
+      <w:r>
+        <w:t xml:space="preserve">PHẦN 5 BÁO CÁO PROJECT THỰC TẬP</w:t>
+      </w:r>
+      <w:r>
+        <w:tab/>
+      </w:r>
+      <w:r>
+        <w:t xml:space="preserve">21</w:t>
+      </w:r>
+    </w:p>
+    <w:p>
+      <w:pPr>
+        <w:pStyle w:val="TOC2"/>
+      </w:pPr>
+      <w:r>
+        <w:t xml:space="preserve">5.1</w:t>
+      </w:r>
+      <w:r>
+        <w:tab/>
+      </w:r>
+      <w:r>
+        <w:t xml:space="preserve">Đặt vấn đề</w:t>
+      </w:r>
+      <w:r>
+        <w:tab/>
+      </w:r>
+      <w:r>
+        <w:t xml:space="preserve">21</w:t>
+      </w:r>
+    </w:p>
+    <w:p>
+      <w:pPr>
+        <w:pStyle w:val="TOC2"/>
+      </w:pPr>
+      <w:r>
+        <w:t xml:space="preserve">5.2</w:t>
+      </w:r>
+      <w:r>
+        <w:tab/>
+      </w:r>
+      <w:r>
+        <w:t xml:space="preserve">Khảo sát nghiên cứu liên quan và cơ sở lý thuyết</w:t>
+      </w:r>
+      <w:r>
+        <w:tab/>
+      </w:r>
+      <w:r>
+        <w:t xml:space="preserve">23</w:t>
+      </w:r>
+    </w:p>
+    <w:p>
+      <w:pPr>
+        <w:pStyle w:val="TOC2"/>
+      </w:pPr>
+      <w:r>
+        <w:t xml:space="preserve">5.3</w:t>
+      </w:r>
+      <w:r>
+        <w:tab/>
+      </w:r>
+      <w:r>
+        <w:t xml:space="preserve">Phân tích và thiết kế hệ thống</w:t>
+      </w:r>
+      <w:r>
+        <w:tab/>
+      </w:r>
+      <w:r>
+        <w:t xml:space="preserve">27</w:t>
+      </w:r>
+    </w:p>
+    <w:p>
+      <w:pPr>
+        <w:pStyle w:val="TOC2"/>
+      </w:pPr>
+      <w:r>
+        <w:t xml:space="preserve">5.4</w:t>
+      </w:r>
+      <w:r>
+        <w:tab/>
+      </w:r>
+      <w:r>
+        <w:t xml:space="preserve">Cài đặt</w:t>
+      </w:r>
+      <w:r>
+        <w:tab/>
+      </w:r>
+      <w:r>
+        <w:t xml:space="preserve">32</w:t>
+      </w:r>
+    </w:p>
+    <w:p>
+      <w:pPr>
+        <w:pStyle w:val="TOC2"/>
+      </w:pPr>
+      <w:r>
+        <w:t xml:space="preserve">5.5</w:t>
+      </w:r>
+      <w:r>
+        <w:tab/>
+      </w:r>
+      <w:r>
+        <w:t xml:space="preserve">Kiểm thử và đánh giá</w:t>
+      </w:r>
+      <w:r>
+        <w:tab/>
+      </w:r>
+      <w:r>
+        <w:t xml:space="preserve">36</w:t>
+      </w:r>
+    </w:p>
+    <w:p>
+      <w:pPr>
+        <w:pStyle w:val="TOC2"/>
+      </w:pPr>
+      <w:r>
+        <w:t xml:space="preserve">5.6</w:t>
+      </w:r>
+      <w:r>
+        <w:tab/>
+      </w:r>
+      <w:r>
+        <w:t xml:space="preserve">Hướng dẫn sử dụng và minh họa chức năng</w:t>
+      </w:r>
+      <w:r>
+        <w:tab/>
+      </w:r>
+      <w:r>
+        <w:t xml:space="preserve">40</w:t>
+      </w:r>
+    </w:p>
+    <w:p>
+      <w:pPr>
+        <w:pStyle w:val="TOC2"/>
+      </w:pPr>
+      <w:r>
+        <w:t xml:space="preserve">5.7</w:t>
+      </w:r>
+      <w:r>
+        <w:tab/>
+      </w:r>
+      <w:r>
+        <w:t xml:space="preserve">Thảo luận, hạn chế và hướng phát triển</w:t>
+      </w:r>
+      <w:r>
+        <w:tab/>
+      </w:r>
+      <w:r>
+        <w:t xml:space="preserve">51</w:t>
+      </w:r>
+    </w:p>
+    <w:p>
+      <w:pPr>
+        <w:pStyle w:val="TOC2"/>
+      </w:pPr>
+      <w:r>
+        <w:t xml:space="preserve">5.8</w:t>
+      </w:r>
+      <w:r>
+        <w:tab/>
+      </w:r>
+      <w:r>
+        <w:t xml:space="preserve">Kết luận</w:t>
+      </w:r>
+      <w:r>
+        <w:tab/>
+      </w:r>
+      <w:r>
+        <w:t xml:space="preserve">53</w:t>
+      </w:r>
+    </w:p>
+    <w:p>
+      <w:pPr>
+        <w:pStyle w:val="TOC2"/>
+      </w:pPr>
+      <w:r>
+        <w:t xml:space="preserve">5.9</w:t>
+      </w:r>
+      <w:r>
+        <w:tab/>
+      </w:r>
+      <w:r>
+        <w:t xml:space="preserve">Tuyên bố</w:t>
+      </w:r>
+      <w:r>
+        <w:tab/>
+      </w:r>
+      <w:r>
+        <w:t xml:space="preserve">53</w:t>
+      </w:r>
+    </w:p>
+    <w:p>
+      <w:pPr>
+        <w:pStyle w:val="TOC1"/>
+      </w:pPr>
+      <w:r>
         <w:t xml:space="preserve">DANH MỤC CÔNG TRÌNH KHOA HỌC CỦA SINH VIÊN</w:t>
       </w:r>
-    </w:p>
-    <w:p>
-      <w:pPr>
-        <w:pStyle w:val="Content"/>
-        <w:spacing w:after="120"/>
-        <w:ind w:firstLine="567"/>
-        <w:jc w:val="both"/>
-      </w:pPr>
-      <w:r>
-        <w:t xml:space="preserve">Ngoài dự án thực tập, sinh viên là tác giả liên hệ của 12 bản thảo nghiên cứu về tài chính, ngân hàng và quản trị doanh nghiệp. Bảng 0.1 liệt kê các bản thảo theo mức độ tiến triển, lấy từ hồ sơ công bố trong tệp README của kho mã và hồ sơ ORCID (0009-0008-3307-6569). Hàng in đậm là bài đã công bố, đã được duyệt đăng hoặc đã sửa xong vòng 2, gồm cả bài có nội dung nối trực tiếp với dự án. Dấu * chỉ tác giả liên hệ, et al. thay cho danh sách đồng tác giả. Chỉ hai bài đầu là công bố chính thức, các bài còn lại có thể thay đổi sau phản biện.</w:t>
-      </w:r>
-    </w:p>
-    <w:p>
-      <w:pPr>
-        <w:pStyle w:val="Heading4"/>
-        <w:keepNext/>
-        <w:numPr>
-          <w:ilvl w:val="0"/>
-          <w:numId w:val="0"/>
-        </w:numPr>
-        <w:spacing w:before="160" w:after="60"/>
-        <w:ind w:left="0" w:firstLine="0"/>
-        <w:jc w:val="center"/>
-      </w:pPr>
-      <w:r>
-        <w:rPr>
-          <w:b/>
-          <w:bCs/>
-          <w:i w:val="0"/>
-          <w:iCs w:val="0"/>
-          <w:sz w:val="24"/>
-          <w:szCs w:val="24"/>
-        </w:rPr>
-        <w:t xml:space="preserve">Bảng 0.1. Sản phẩm khoa học của sinh viên</w:t>
-      </w:r>
-    </w:p>
-    <w:tbl>
-      <w:tblPr>
-        <w:tblW w:w="8788" w:type="dxa"/>
-        <w:tblBorders>
-          <w:top w:val="single" w:sz="4" w:space="0" w:color="808080"/>
-          <w:left w:val="single" w:sz="4" w:space="0" w:color="808080"/>
-          <w:bottom w:val="single" w:sz="4" w:space="0" w:color="808080"/>
-          <w:right w:val="single" w:sz="4" w:space="0" w:color="808080"/>
-          <w:insideH w:val="single" w:sz="4" w:space="0" w:color="808080"/>
-          <w:insideV w:val="single" w:sz="4" w:space="0" w:color="808080"/>
-        </w:tblBorders>
-        <w:tblLayout w:type="fixed"/>
-        <w:tblCellMar>
-          <w:top w:w="40" w:type="dxa"/>
-          <w:left w:w="80" w:type="dxa"/>
-          <w:bottom w:w="40" w:type="dxa"/>
-          <w:right w:w="80" w:type="dxa"/>
-        </w:tblCellMar>
-      </w:tblPr>
-      <w:tblGrid>
-        <w:gridCol w:w="703"/>
-        <w:gridCol w:w="2543"/>
-        <w:gridCol w:w="2800"/>
-        <w:gridCol w:w="923"/>
-        <w:gridCol w:w="1819"/>
-      </w:tblGrid>
-      <w:tr>
-        <w:trPr>
-          <w:cantSplit/>
-          <w:tblHeader/>
-        </w:trPr>
-        <w:tc>
-          <w:tcPr>
-            <w:tcW w:w="703" w:type="dxa"/>
-          </w:tcPr>
-          <w:p>
-            <w:pPr>
-              <w:spacing w:before="20" w:after="20"/>
-              <w:jc w:val="center"/>
-            </w:pPr>
-            <w:r>
-              <w:rPr>
-                <w:b/>
-                <w:bCs/>
-                <w:sz w:val="20"/>
-                <w:szCs w:val="20"/>
-              </w:rPr>
-              <w:t xml:space="preserve">STT</w:t>
-            </w:r>
-          </w:p>
-        </w:tc>
-        <w:tc>
-          <w:tcPr>
-            <w:tcW w:w="2543" w:type="dxa"/>
-          </w:tcPr>
-          <w:p>
-            <w:pPr>
-              <w:spacing w:before="20" w:after="20"/>
-              <w:jc w:val="center"/>
-            </w:pPr>
-            <w:r>
-              <w:rPr>
-                <w:b/>
-                <w:bCs/>
-                <w:sz w:val="20"/>
-                <w:szCs w:val="20"/>
-              </w:rPr>
-              <w:t xml:space="preserve">Tên bài</w:t>
-            </w:r>
-          </w:p>
-        </w:tc>
-        <w:tc>
-          <w:tcPr>
-            <w:tcW w:w="2800" w:type="dxa"/>
-          </w:tcPr>
-          <w:p>
-            <w:pPr>
-              <w:spacing w:before="20" w:after="20"/>
-              <w:jc w:val="center"/>
-            </w:pPr>
-            <w:r>
-              <w:rPr>
-                <w:b/>
-                <w:bCs/>
-                <w:sz w:val="20"/>
-                <w:szCs w:val="20"/>
-              </w:rPr>
-              <w:t xml:space="preserve">Tạp chí</w:t>
-            </w:r>
-          </w:p>
-        </w:tc>
-        <w:tc>
-          <w:tcPr>
-            <w:tcW w:w="923" w:type="dxa"/>
-          </w:tcPr>
-          <w:p>
-            <w:pPr>
-              <w:spacing w:before="20" w:after="20"/>
-              <w:jc w:val="center"/>
-            </w:pPr>
-            <w:r>
-              <w:rPr>
-                <w:b/>
-                <w:bCs/>
-                <w:sz w:val="20"/>
-                <w:szCs w:val="20"/>
-              </w:rPr>
-              <w:t xml:space="preserve">Chỉ mục</w:t>
-            </w:r>
-          </w:p>
-        </w:tc>
-        <w:tc>
-          <w:tcPr>
-            <w:tcW w:w="1819" w:type="dxa"/>
-          </w:tcPr>
-          <w:p>
-            <w:pPr>
-              <w:spacing w:before="20" w:after="20"/>
-              <w:jc w:val="center"/>
-            </w:pPr>
-            <w:r>
-              <w:rPr>
-                <w:b/>
-                <w:bCs/>
-                <w:sz w:val="20"/>
-                <w:szCs w:val="20"/>
-              </w:rPr>
-              <w:t xml:space="preserve">Tình trạng</w:t>
-            </w:r>
-          </w:p>
-        </w:tc>
-      </w:tr>
-      <w:tr>
-        <w:trPr>
-          <w:cantSplit/>
-        </w:trPr>
-        <w:tc>
-          <w:tcPr>
-            <w:tcW w:w="703" w:type="dxa"/>
-          </w:tcPr>
-          <w:p>
-            <w:pPr>
-              <w:spacing w:before="20" w:after="20"/>
-            </w:pPr>
-            <w:r>
-              <w:rPr>
-                <w:b/>
-                <w:bCs/>
-                <w:sz w:val="20"/>
-                <w:szCs w:val="20"/>
-              </w:rPr>
-              <w:t xml:space="preserve">1</w:t>
-            </w:r>
-          </w:p>
-        </w:tc>
-        <w:tc>
-          <w:tcPr>
-            <w:tcW w:w="2543" w:type="dxa"/>
-          </w:tcPr>
-          <w:p>
-            <w:pPr>
-              <w:spacing w:before="20" w:after="20"/>
-            </w:pPr>
-            <w:r>
-              <w:rPr>
-                <w:b/>
-                <w:bCs/>
-                <w:sz w:val="20"/>
-                <w:szCs w:val="20"/>
-              </w:rPr>
-              <w:t xml:space="preserve">Black-Litterman portfolio optimization using regime switching CAPM and ABC-MCMC: Empirical evidence from the Vietnamese stock market period 2019-2025</w:t>
-            </w:r>
-          </w:p>
-        </w:tc>
-        <w:tc>
-          <w:tcPr>
-            <w:tcW w:w="2800" w:type="dxa"/>
-          </w:tcPr>
-          <w:p>
-            <w:pPr>
-              <w:spacing w:before="20" w:after="20"/>
-            </w:pPr>
-            <w:r>
-              <w:rPr>
-                <w:b/>
-                <w:bCs/>
-                <w:sz w:val="20"/>
-                <w:szCs w:val="20"/>
-              </w:rPr>
-              <w:t xml:space="preserve">Journal of Policy and Development Research, tập 01, tr. 81-99, 2026, doi: 10.63640/3030-4091/jpd.apd.194</w:t>
-            </w:r>
-          </w:p>
-        </w:tc>
-        <w:tc>
-          <w:tcPr>
-            <w:tcW w:w="923" w:type="dxa"/>
-          </w:tcPr>
-          <w:p>
-            <w:pPr>
-              <w:spacing w:before="20" w:after="20"/>
-            </w:pPr>
-            <w:r>
-              <w:rPr>
-                <w:b/>
-                <w:bCs/>
-                <w:sz w:val="20"/>
-                <w:szCs w:val="20"/>
-              </w:rPr>
-              <w:t xml:space="preserve">Trong nước</w:t>
-            </w:r>
-          </w:p>
-        </w:tc>
-        <w:tc>
-          <w:tcPr>
-            <w:tcW w:w="1819" w:type="dxa"/>
-          </w:tcPr>
-          <w:p>
-            <w:pPr>
-              <w:spacing w:before="20" w:after="20"/>
-            </w:pPr>
-            <w:r>
-              <w:rPr>
-                <w:b/>
-                <w:bCs/>
-                <w:sz w:val="20"/>
-                <w:szCs w:val="20"/>
-              </w:rPr>
-              <w:t xml:space="preserve">Đã xuất bản</w:t>
-            </w:r>
-          </w:p>
-        </w:tc>
-      </w:tr>
-      <w:tr>
-        <w:trPr>
-          <w:cantSplit/>
-        </w:trPr>
-        <w:tc>
-          <w:tcPr>
-            <w:tcW w:w="703" w:type="dxa"/>
-          </w:tcPr>
-          <w:p>
-            <w:pPr>
-              <w:spacing w:before="20" w:after="20"/>
-            </w:pPr>
-            <w:r>
-              <w:rPr>
-                <w:b/>
-                <w:bCs/>
-                <w:sz w:val="20"/>
-                <w:szCs w:val="20"/>
-              </w:rPr>
-              <w:t xml:space="preserve">2</w:t>
-            </w:r>
-          </w:p>
-        </w:tc>
-        <w:tc>
-          <w:tcPr>
-            <w:tcW w:w="2543" w:type="dxa"/>
-          </w:tcPr>
-          <w:p>
-            <w:pPr>
-              <w:spacing w:before="20" w:after="20"/>
-            </w:pPr>
-            <w:r>
-              <w:rPr>
-                <w:b/>
-                <w:bCs/>
-                <w:sz w:val="20"/>
-                <w:szCs w:val="20"/>
-              </w:rPr>
-              <w:t xml:space="preserve">Tiền gửi không kỳ hạn, hiệu quả hoạt động và ổn định tài chính ngân hàng: Bằng chứng từ mô hình ngưỡng tại Việt Nam</w:t>
-            </w:r>
-          </w:p>
-        </w:tc>
-        <w:tc>
-          <w:tcPr>
-            <w:tcW w:w="2800" w:type="dxa"/>
-          </w:tcPr>
-          <w:p>
-            <w:pPr>
-              <w:spacing w:before="20" w:after="20"/>
-            </w:pPr>
-            <w:r>
-              <w:rPr>
-                <w:b/>
-                <w:bCs/>
-                <w:sz w:val="20"/>
-                <w:szCs w:val="20"/>
-              </w:rPr>
-              <w:t xml:space="preserve">Tạp chí Kinh tế - Luật và Ngân hàng, 2026, doi: 10.59276/3030-4199/jelb.bav.895</w:t>
-            </w:r>
-          </w:p>
-        </w:tc>
-        <w:tc>
-          <w:tcPr>
-            <w:tcW w:w="923" w:type="dxa"/>
-          </w:tcPr>
-          <w:p>
-            <w:pPr>
-              <w:spacing w:before="20" w:after="20"/>
-            </w:pPr>
-            <w:r>
-              <w:rPr>
-                <w:b/>
-                <w:bCs/>
-                <w:sz w:val="20"/>
-                <w:szCs w:val="20"/>
-              </w:rPr>
-              <w:t xml:space="preserve">Trong nước</w:t>
-            </w:r>
-          </w:p>
-        </w:tc>
-        <w:tc>
-          <w:tcPr>
-            <w:tcW w:w="1819" w:type="dxa"/>
-          </w:tcPr>
-          <w:p>
-            <w:pPr>
-              <w:spacing w:before="20" w:after="20"/>
-            </w:pPr>
-            <w:r>
-              <w:rPr>
-                <w:b/>
-                <w:bCs/>
-                <w:sz w:val="20"/>
-                <w:szCs w:val="20"/>
-              </w:rPr>
-              <w:t xml:space="preserve">Đã đăng</w:t>
-            </w:r>
-          </w:p>
-        </w:tc>
-      </w:tr>
-      <w:tr>
-        <w:trPr>
-          <w:cantSplit/>
-        </w:trPr>
-        <w:tc>
-          <w:tcPr>
-            <w:tcW w:w="703" w:type="dxa"/>
-          </w:tcPr>
-          <w:p>
-            <w:pPr>
-              <w:spacing w:before="20" w:after="20"/>
-            </w:pPr>
-            <w:r>
-              <w:rPr>
-                <w:b/>
-                <w:bCs/>
-                <w:sz w:val="20"/>
-                <w:szCs w:val="20"/>
-              </w:rPr>
-              <w:t xml:space="preserve">3</w:t>
-            </w:r>
-          </w:p>
-        </w:tc>
-        <w:tc>
-          <w:tcPr>
-            <w:tcW w:w="2543" w:type="dxa"/>
-          </w:tcPr>
-          <w:p>
-            <w:pPr>
-              <w:spacing w:before="20" w:after="20"/>
-            </w:pPr>
-            <w:r>
-              <w:rPr>
-                <w:b/>
-                <w:bCs/>
-                <w:sz w:val="20"/>
-                <w:szCs w:val="20"/>
-              </w:rPr>
-              <w:t xml:space="preserve">GRI adoption and corporate brownwashing: Board governance evidence from ASEAN-5</w:t>
-            </w:r>
-          </w:p>
-        </w:tc>
-        <w:tc>
-          <w:tcPr>
-            <w:tcW w:w="2800" w:type="dxa"/>
-          </w:tcPr>
-          <w:p>
-            <w:pPr>
-              <w:spacing w:before="20" w:after="20"/>
-            </w:pPr>
-            <w:r>
-              <w:rPr>
-                <w:b/>
-                <w:bCs/>
-                <w:sz w:val="20"/>
-                <w:szCs w:val="20"/>
-              </w:rPr>
-              <w:t xml:space="preserve">International Journal of Management and Sustainability</w:t>
-            </w:r>
-          </w:p>
-        </w:tc>
-        <w:tc>
-          <w:tcPr>
-            <w:tcW w:w="923" w:type="dxa"/>
-          </w:tcPr>
-          <w:p>
-            <w:pPr>
-              <w:spacing w:before="20" w:after="20"/>
-            </w:pPr>
-            <w:r>
-              <w:rPr>
-                <w:b/>
-                <w:bCs/>
-                <w:sz w:val="20"/>
-                <w:szCs w:val="20"/>
-              </w:rPr>
-              <w:t xml:space="preserve">Scopus Q3</w:t>
-            </w:r>
-          </w:p>
-        </w:tc>
-        <w:tc>
-          <w:tcPr>
-            <w:tcW w:w="1819" w:type="dxa"/>
-          </w:tcPr>
-          <w:p>
-            <w:pPr>
-              <w:spacing w:before="20" w:after="20"/>
-            </w:pPr>
-            <w:r>
-              <w:rPr>
-                <w:b/>
-                <w:bCs/>
-                <w:sz w:val="20"/>
-                <w:szCs w:val="20"/>
-              </w:rPr>
-              <w:t xml:space="preserve">Đã duyệt đăng</w:t>
-            </w:r>
-          </w:p>
-        </w:tc>
-      </w:tr>
-      <w:tr>
-        <w:trPr>
-          <w:cantSplit/>
-        </w:trPr>
-        <w:tc>
-          <w:tcPr>
-            <w:tcW w:w="703" w:type="dxa"/>
-          </w:tcPr>
-          <w:p>
-            <w:pPr>
-              <w:spacing w:before="20" w:after="20"/>
-            </w:pPr>
-            <w:r>
-              <w:rPr>
-                <w:b/>
-                <w:bCs/>
-                <w:sz w:val="20"/>
-                <w:szCs w:val="20"/>
-              </w:rPr>
-              <w:t xml:space="preserve">4</w:t>
-            </w:r>
-          </w:p>
-        </w:tc>
-        <w:tc>
-          <w:tcPr>
-            <w:tcW w:w="2543" w:type="dxa"/>
-          </w:tcPr>
-          <w:p>
-            <w:pPr>
-              <w:spacing w:before="20" w:after="20"/>
-            </w:pPr>
-            <w:r>
-              <w:rPr>
-                <w:b/>
-                <w:bCs/>
-                <w:sz w:val="20"/>
-                <w:szCs w:val="20"/>
-              </w:rPr>
-              <w:t xml:space="preserve">Portfolio optimization with the inverse Black-Litterman framework and clustering machine-learning models: Evidence from Vietnamese bank stocks</w:t>
-            </w:r>
-          </w:p>
-        </w:tc>
-        <w:tc>
-          <w:tcPr>
-            <w:tcW w:w="2800" w:type="dxa"/>
-          </w:tcPr>
-          <w:p>
-            <w:pPr>
-              <w:spacing w:before="20" w:after="20"/>
-            </w:pPr>
-            <w:r>
-              <w:rPr>
-                <w:b/>
-                <w:bCs/>
-                <w:sz w:val="20"/>
-                <w:szCs w:val="20"/>
-              </w:rPr>
-              <w:t xml:space="preserve">Multidisciplinary Science Journal</w:t>
-            </w:r>
-          </w:p>
-        </w:tc>
-        <w:tc>
-          <w:tcPr>
-            <w:tcW w:w="923" w:type="dxa"/>
-          </w:tcPr>
-          <w:p>
-            <w:pPr>
-              <w:spacing w:before="20" w:after="20"/>
-            </w:pPr>
-            <w:r>
-              <w:rPr>
-                <w:b/>
-                <w:bCs/>
-                <w:sz w:val="20"/>
-                <w:szCs w:val="20"/>
-              </w:rPr>
-              <w:t xml:space="preserve">Scopus Q3</w:t>
-            </w:r>
-          </w:p>
-        </w:tc>
-        <w:tc>
-          <w:tcPr>
-            <w:tcW w:w="1819" w:type="dxa"/>
-          </w:tcPr>
-          <w:p>
-            <w:pPr>
-              <w:spacing w:before="20" w:after="20"/>
-            </w:pPr>
-            <w:r>
-              <w:rPr>
-                <w:b/>
-                <w:bCs/>
-                <w:sz w:val="20"/>
-                <w:szCs w:val="20"/>
-              </w:rPr>
-              <w:t xml:space="preserve">Đã sửa xong vòng 2</w:t>
-            </w:r>
-          </w:p>
-        </w:tc>
-      </w:tr>
-      <w:tr>
-        <w:trPr>
-          <w:cantSplit/>
-        </w:trPr>
-        <w:tc>
-          <w:tcPr>
-            <w:tcW w:w="703" w:type="dxa"/>
-          </w:tcPr>
-          <w:p>
-            <w:pPr>
-              <w:spacing w:before="20" w:after="20"/>
-            </w:pPr>
-            <w:r>
-              <w:rPr>
-                <w:sz w:val="20"/>
-                <w:szCs w:val="20"/>
-              </w:rPr>
-              <w:t xml:space="preserve">5</w:t>
-            </w:r>
-          </w:p>
-        </w:tc>
-        <w:tc>
-          <w:tcPr>
-            <w:tcW w:w="2543" w:type="dxa"/>
-          </w:tcPr>
-          <w:p>
-            <w:pPr>
-              <w:spacing w:before="20" w:after="20"/>
-            </w:pPr>
-            <w:r>
-              <w:rPr>
-                <w:sz w:val="20"/>
-                <w:szCs w:val="20"/>
-              </w:rPr>
-              <w:t xml:space="preserve">Tác động của cấu trúc sở hữu lên ổn định tài chính của các ngân hàng thương mại Việt Nam</w:t>
-            </w:r>
-          </w:p>
-        </w:tc>
-        <w:tc>
-          <w:tcPr>
-            <w:tcW w:w="2800" w:type="dxa"/>
-          </w:tcPr>
-          <w:p>
-            <w:pPr>
-              <w:spacing w:before="20" w:after="20"/>
-            </w:pPr>
-            <w:r>
-              <w:rPr>
-                <w:sz w:val="20"/>
-                <w:szCs w:val="20"/>
-              </w:rPr>
-              <w:t xml:space="preserve">Tạp chí Kinh tế - Luật và Ngân hàng</w:t>
-            </w:r>
-          </w:p>
-        </w:tc>
-        <w:tc>
-          <w:tcPr>
-            <w:tcW w:w="923" w:type="dxa"/>
-          </w:tcPr>
-          <w:p>
-            <w:pPr>
-              <w:spacing w:before="20" w:after="20"/>
-            </w:pPr>
-            <w:r>
-              <w:rPr>
-                <w:sz w:val="20"/>
-                <w:szCs w:val="20"/>
-              </w:rPr>
-              <w:t xml:space="preserve">Trong nước</w:t>
-            </w:r>
-          </w:p>
-        </w:tc>
-        <w:tc>
-          <w:tcPr>
-            <w:tcW w:w="1819" w:type="dxa"/>
-          </w:tcPr>
-          <w:p>
-            <w:pPr>
-              <w:spacing w:before="20" w:after="20"/>
-            </w:pPr>
-            <w:r>
-              <w:rPr>
-                <w:sz w:val="20"/>
-                <w:szCs w:val="20"/>
-              </w:rPr>
-              <w:t xml:space="preserve">Chờ duyệt đăng sau 2 vòng phản biện</w:t>
-            </w:r>
-          </w:p>
-        </w:tc>
-      </w:tr>
-      <w:tr>
-        <w:trPr>
-          <w:cantSplit/>
-        </w:trPr>
-        <w:tc>
-          <w:tcPr>
-            <w:tcW w:w="703" w:type="dxa"/>
-          </w:tcPr>
-          <w:p>
-            <w:pPr>
-              <w:spacing w:before="20" w:after="20"/>
-            </w:pPr>
-            <w:r>
-              <w:rPr>
-                <w:sz w:val="20"/>
-                <w:szCs w:val="20"/>
-              </w:rPr>
-              <w:t xml:space="preserve">6</w:t>
-            </w:r>
-          </w:p>
-        </w:tc>
-        <w:tc>
-          <w:tcPr>
-            <w:tcW w:w="2543" w:type="dxa"/>
-          </w:tcPr>
-          <w:p>
-            <w:pPr>
-              <w:spacing w:before="20" w:after="20"/>
-            </w:pPr>
-            <w:r>
-              <w:rPr>
-                <w:sz w:val="20"/>
-                <w:szCs w:val="20"/>
-              </w:rPr>
-              <w:t xml:space="preserve">Limits to arbitrage in the Vietnamese physical gold market: The failure of short-term momentum</w:t>
-            </w:r>
-          </w:p>
-        </w:tc>
-        <w:tc>
-          <w:tcPr>
-            <w:tcW w:w="2800" w:type="dxa"/>
-          </w:tcPr>
-          <w:p>
-            <w:pPr>
-              <w:spacing w:before="20" w:after="20"/>
-            </w:pPr>
-            <w:r>
-              <w:rPr>
-                <w:sz w:val="20"/>
-                <w:szCs w:val="20"/>
-              </w:rPr>
-              <w:t xml:space="preserve">Journal of Economic and Banking Studies</w:t>
-            </w:r>
-          </w:p>
-        </w:tc>
-        <w:tc>
-          <w:tcPr>
-            <w:tcW w:w="923" w:type="dxa"/>
-          </w:tcPr>
-          <w:p>
-            <w:pPr>
-              <w:spacing w:before="20" w:after="20"/>
-            </w:pPr>
-            <w:r>
-              <w:rPr>
-                <w:sz w:val="20"/>
-                <w:szCs w:val="20"/>
-              </w:rPr>
-              <w:t xml:space="preserve">Trong nước</w:t>
-            </w:r>
-          </w:p>
-        </w:tc>
-        <w:tc>
-          <w:tcPr>
-            <w:tcW w:w="1819" w:type="dxa"/>
-          </w:tcPr>
-          <w:p>
-            <w:pPr>
-              <w:spacing w:before="20" w:after="20"/>
-            </w:pPr>
-            <w:r>
-              <w:rPr>
-                <w:sz w:val="20"/>
-                <w:szCs w:val="20"/>
-              </w:rPr>
-              <w:t xml:space="preserve">Đang sửa vòng 1</w:t>
-            </w:r>
-          </w:p>
-        </w:tc>
-      </w:tr>
-      <w:tr>
-        <w:trPr>
-          <w:cantSplit/>
-        </w:trPr>
-        <w:tc>
-          <w:tcPr>
-            <w:tcW w:w="703" w:type="dxa"/>
-          </w:tcPr>
-          <w:p>
-            <w:pPr>
-              <w:spacing w:before="20" w:after="20"/>
-            </w:pPr>
-            <w:r>
-              <w:rPr>
-                <w:sz w:val="20"/>
-                <w:szCs w:val="20"/>
-              </w:rPr>
-              <w:t xml:space="preserve">7</w:t>
-            </w:r>
-          </w:p>
-        </w:tc>
-        <w:tc>
-          <w:tcPr>
-            <w:tcW w:w="2543" w:type="dxa"/>
-          </w:tcPr>
-          <w:p>
-            <w:pPr>
-              <w:spacing w:before="20" w:after="20"/>
-            </w:pPr>
-            <w:r>
-              <w:rPr>
-                <w:sz w:val="20"/>
-                <w:szCs w:val="20"/>
-              </w:rPr>
-              <w:t xml:space="preserve">Corporate brownwashing and firm valuation in ASEAN-5 disclosure regimes</w:t>
-            </w:r>
-          </w:p>
-        </w:tc>
-        <w:tc>
-          <w:tcPr>
-            <w:tcW w:w="2800" w:type="dxa"/>
-          </w:tcPr>
-          <w:p>
-            <w:pPr>
-              <w:spacing w:before="20" w:after="20"/>
-            </w:pPr>
-            <w:r>
-              <w:rPr>
-                <w:sz w:val="20"/>
-                <w:szCs w:val="20"/>
-              </w:rPr>
-              <w:t xml:space="preserve">Cogent Business &amp; Management</w:t>
-            </w:r>
-          </w:p>
-        </w:tc>
-        <w:tc>
-          <w:tcPr>
-            <w:tcW w:w="923" w:type="dxa"/>
-          </w:tcPr>
-          <w:p>
-            <w:pPr>
-              <w:spacing w:before="20" w:after="20"/>
-            </w:pPr>
-            <w:r>
-              <w:rPr>
-                <w:sz w:val="20"/>
-                <w:szCs w:val="20"/>
-              </w:rPr>
-              <w:t xml:space="preserve">ESCI, Scopus Q2</w:t>
-            </w:r>
-          </w:p>
-        </w:tc>
-        <w:tc>
-          <w:tcPr>
-            <w:tcW w:w="1819" w:type="dxa"/>
-          </w:tcPr>
-          <w:p>
-            <w:pPr>
-              <w:spacing w:before="20" w:after="20"/>
-            </w:pPr>
-            <w:r>
-              <w:rPr>
-                <w:sz w:val="20"/>
-                <w:szCs w:val="20"/>
-              </w:rPr>
-              <w:t xml:space="preserve">Đang phản biện vòng 1</w:t>
-            </w:r>
-          </w:p>
-        </w:tc>
-      </w:tr>
-      <w:tr>
-        <w:trPr>
-          <w:cantSplit/>
-        </w:trPr>
-        <w:tc>
-          <w:tcPr>
-            <w:tcW w:w="703" w:type="dxa"/>
-          </w:tcPr>
-          <w:p>
-            <w:pPr>
-              <w:spacing w:before="20" w:after="20"/>
-            </w:pPr>
-            <w:r>
-              <w:rPr>
-                <w:sz w:val="20"/>
-                <w:szCs w:val="20"/>
-              </w:rPr>
-              <w:t xml:space="preserve">8</w:t>
-            </w:r>
-          </w:p>
-        </w:tc>
-        <w:tc>
-          <w:tcPr>
-            <w:tcW w:w="2543" w:type="dxa"/>
-          </w:tcPr>
-          <w:p>
-            <w:pPr>
-              <w:spacing w:before="20" w:after="20"/>
-            </w:pPr>
-            <w:r>
-              <w:rPr>
-                <w:sz w:val="20"/>
-                <w:szCs w:val="20"/>
-              </w:rPr>
-              <w:t xml:space="preserve">Structural breaks in Vietnamese stock market liquidity: Evidence from the Amihud illiquidity measure and Bai-Perron regime-shift detection</w:t>
-            </w:r>
-          </w:p>
-        </w:tc>
-        <w:tc>
-          <w:tcPr>
-            <w:tcW w:w="2800" w:type="dxa"/>
-          </w:tcPr>
-          <w:p>
-            <w:pPr>
-              <w:spacing w:before="20" w:after="20"/>
-            </w:pPr>
-            <w:r>
-              <w:rPr>
-                <w:sz w:val="20"/>
-                <w:szCs w:val="20"/>
-              </w:rPr>
-              <w:t xml:space="preserve">Asian Journal of Economics and Banking</w:t>
-            </w:r>
-          </w:p>
-        </w:tc>
-        <w:tc>
-          <w:tcPr>
-            <w:tcW w:w="923" w:type="dxa"/>
-          </w:tcPr>
-          <w:p>
-            <w:pPr>
-              <w:spacing w:before="20" w:after="20"/>
-            </w:pPr>
-            <w:r>
-              <w:rPr>
-                <w:sz w:val="20"/>
-                <w:szCs w:val="20"/>
-              </w:rPr>
-              <w:t xml:space="preserve">Chưa xác định</w:t>
-            </w:r>
-          </w:p>
-        </w:tc>
-        <w:tc>
-          <w:tcPr>
-            <w:tcW w:w="1819" w:type="dxa"/>
-          </w:tcPr>
-          <w:p>
-            <w:pPr>
-              <w:spacing w:before="20" w:after="20"/>
-            </w:pPr>
-            <w:r>
-              <w:rPr>
-                <w:sz w:val="20"/>
-                <w:szCs w:val="20"/>
-              </w:rPr>
-              <w:t xml:space="preserve">Đang tìm phản biện</w:t>
-            </w:r>
-          </w:p>
-        </w:tc>
-      </w:tr>
-      <w:tr>
-        <w:trPr>
-          <w:cantSplit/>
-        </w:trPr>
-        <w:tc>
-          <w:tcPr>
-            <w:tcW w:w="703" w:type="dxa"/>
-          </w:tcPr>
-          <w:p>
-            <w:pPr>
-              <w:spacing w:before="20" w:after="20"/>
-            </w:pPr>
-            <w:r>
-              <w:rPr>
-                <w:sz w:val="20"/>
-                <w:szCs w:val="20"/>
-              </w:rPr>
-              <w:t xml:space="preserve">9</w:t>
-            </w:r>
-          </w:p>
-        </w:tc>
-        <w:tc>
-          <w:tcPr>
-            <w:tcW w:w="2543" w:type="dxa"/>
-          </w:tcPr>
-          <w:p>
-            <w:pPr>
-              <w:spacing w:before="20" w:after="20"/>
-            </w:pPr>
-            <w:r>
-              <w:rPr>
-                <w:sz w:val="20"/>
-                <w:szCs w:val="20"/>
-              </w:rPr>
-              <w:t xml:space="preserve">Nested equity index correlations overstate true co-movement: Evidence from Vietnam</w:t>
-            </w:r>
-          </w:p>
-        </w:tc>
-        <w:tc>
-          <w:tcPr>
-            <w:tcW w:w="2800" w:type="dxa"/>
-          </w:tcPr>
-          <w:p>
-            <w:pPr>
-              <w:spacing w:before="20" w:after="20"/>
-            </w:pPr>
-            <w:r>
-              <w:rPr>
-                <w:sz w:val="20"/>
-                <w:szCs w:val="20"/>
-              </w:rPr>
-              <w:t xml:space="preserve">Asia-Pacific Financial Markets</w:t>
-            </w:r>
-          </w:p>
-        </w:tc>
-        <w:tc>
-          <w:tcPr>
-            <w:tcW w:w="923" w:type="dxa"/>
-          </w:tcPr>
-          <w:p>
-            <w:pPr>
-              <w:spacing w:before="20" w:after="20"/>
-            </w:pPr>
-            <w:r>
-              <w:rPr>
-                <w:sz w:val="20"/>
-                <w:szCs w:val="20"/>
-              </w:rPr>
-              <w:t xml:space="preserve">Scopus Q2</w:t>
-            </w:r>
-          </w:p>
-        </w:tc>
-        <w:tc>
-          <w:tcPr>
-            <w:tcW w:w="1819" w:type="dxa"/>
-          </w:tcPr>
-          <w:p>
-            <w:pPr>
-              <w:spacing w:before="20" w:after="20"/>
-            </w:pPr>
-            <w:r>
-              <w:rPr>
-                <w:sz w:val="20"/>
-                <w:szCs w:val="20"/>
-              </w:rPr>
-              <w:t xml:space="preserve">With Editor</w:t>
-            </w:r>
-          </w:p>
-        </w:tc>
-      </w:tr>
-      <w:tr>
-        <w:trPr>
-          <w:cantSplit/>
-        </w:trPr>
-        <w:tc>
-          <w:tcPr>
-            <w:tcW w:w="703" w:type="dxa"/>
-          </w:tcPr>
-          <w:p>
-            <w:pPr>
-              <w:spacing w:before="20" w:after="20"/>
-            </w:pPr>
-            <w:r>
-              <w:rPr>
-                <w:sz w:val="20"/>
-                <w:szCs w:val="20"/>
-              </w:rPr>
-              <w:t xml:space="preserve">10</w:t>
-            </w:r>
-          </w:p>
-        </w:tc>
-        <w:tc>
-          <w:tcPr>
-            <w:tcW w:w="2543" w:type="dxa"/>
-          </w:tcPr>
-          <w:p>
-            <w:pPr>
-              <w:spacing w:before="20" w:after="20"/>
-            </w:pPr>
-            <w:r>
-              <w:rPr>
-                <w:sz w:val="20"/>
-                <w:szCs w:val="20"/>
-              </w:rPr>
-              <w:t xml:space="preserve">Who gains from a market upgrade? Stock liquidity and prices around Vietnam's FTSE Russell reclassification</w:t>
-            </w:r>
-          </w:p>
-        </w:tc>
-        <w:tc>
-          <w:tcPr>
-            <w:tcW w:w="2800" w:type="dxa"/>
-          </w:tcPr>
-          <w:p>
-            <w:pPr>
-              <w:spacing w:before="20" w:after="20"/>
-            </w:pPr>
-            <w:r>
-              <w:rPr>
-                <w:sz w:val="20"/>
-                <w:szCs w:val="20"/>
-              </w:rPr>
-              <w:t xml:space="preserve">Finance Research Open</w:t>
-            </w:r>
-          </w:p>
-        </w:tc>
-        <w:tc>
-          <w:tcPr>
-            <w:tcW w:w="923" w:type="dxa"/>
-          </w:tcPr>
-          <w:p>
-            <w:pPr>
-              <w:spacing w:before="20" w:after="20"/>
-            </w:pPr>
-            <w:r>
-              <w:rPr>
-                <w:sz w:val="20"/>
-                <w:szCs w:val="20"/>
-              </w:rPr>
-              <w:t xml:space="preserve">Chưa xác định</w:t>
-            </w:r>
-          </w:p>
-        </w:tc>
-        <w:tc>
-          <w:tcPr>
-            <w:tcW w:w="1819" w:type="dxa"/>
-          </w:tcPr>
-          <w:p>
-            <w:pPr>
-              <w:spacing w:before="20" w:after="20"/>
-            </w:pPr>
-            <w:r>
-              <w:rPr>
-                <w:sz w:val="20"/>
-                <w:szCs w:val="20"/>
-              </w:rPr>
-              <w:t xml:space="preserve">With Editor</w:t>
-            </w:r>
-          </w:p>
-        </w:tc>
-      </w:tr>
-      <w:tr>
-        <w:trPr>
-          <w:cantSplit/>
-        </w:trPr>
-        <w:tc>
-          <w:tcPr>
-            <w:tcW w:w="703" w:type="dxa"/>
-          </w:tcPr>
-          <w:p>
-            <w:pPr>
-              <w:spacing w:before="20" w:after="20"/>
-            </w:pPr>
-            <w:r>
-              <w:rPr>
-                <w:sz w:val="20"/>
-                <w:szCs w:val="20"/>
-              </w:rPr>
-              <w:t xml:space="preserve">11</w:t>
-            </w:r>
-          </w:p>
-        </w:tc>
-        <w:tc>
-          <w:tcPr>
-            <w:tcW w:w="2543" w:type="dxa"/>
-          </w:tcPr>
-          <w:p>
-            <w:pPr>
-              <w:spacing w:before="20" w:after="20"/>
-            </w:pPr>
-            <w:r>
-              <w:rPr>
-                <w:sz w:val="20"/>
-                <w:szCs w:val="20"/>
-              </w:rPr>
-              <w:t xml:space="preserve">Rated at the peak? Firm valuation around the first LSEG ESG score in five Southeast Asian markets</w:t>
-            </w:r>
-          </w:p>
-        </w:tc>
-        <w:tc>
-          <w:tcPr>
-            <w:tcW w:w="2800" w:type="dxa"/>
-          </w:tcPr>
-          <w:p>
-            <w:pPr>
-              <w:spacing w:before="20" w:after="20"/>
-            </w:pPr>
-            <w:r>
-              <w:rPr>
-                <w:sz w:val="20"/>
-                <w:szCs w:val="20"/>
-              </w:rPr>
-              <w:t xml:space="preserve">Accounting Open</w:t>
-            </w:r>
-          </w:p>
-        </w:tc>
-        <w:tc>
-          <w:tcPr>
-            <w:tcW w:w="923" w:type="dxa"/>
-          </w:tcPr>
-          <w:p>
-            <w:pPr>
-              <w:spacing w:before="20" w:after="20"/>
-            </w:pPr>
-            <w:r>
-              <w:rPr>
-                <w:sz w:val="20"/>
-                <w:szCs w:val="20"/>
-              </w:rPr>
-              <w:t xml:space="preserve">Chưa xác định</w:t>
-            </w:r>
-          </w:p>
-        </w:tc>
-        <w:tc>
-          <w:tcPr>
-            <w:tcW w:w="1819" w:type="dxa"/>
-          </w:tcPr>
-          <w:p>
-            <w:pPr>
-              <w:spacing w:before="20" w:after="20"/>
-            </w:pPr>
-            <w:r>
-              <w:rPr>
-                <w:sz w:val="20"/>
-                <w:szCs w:val="20"/>
-              </w:rPr>
-              <w:t xml:space="preserve">With Editor</w:t>
-            </w:r>
-          </w:p>
-        </w:tc>
-      </w:tr>
-      <w:tr>
-        <w:trPr>
-          <w:cantSplit/>
-        </w:trPr>
-        <w:tc>
-          <w:tcPr>
-            <w:tcW w:w="703" w:type="dxa"/>
-          </w:tcPr>
-          <w:p>
-            <w:pPr>
-              <w:spacing w:before="20" w:after="20"/>
-            </w:pPr>
-            <w:r>
-              <w:rPr>
-                <w:sz w:val="20"/>
-                <w:szCs w:val="20"/>
-              </w:rPr>
-              <w:t xml:space="preserve">12</w:t>
-            </w:r>
-          </w:p>
-        </w:tc>
-        <w:tc>
-          <w:tcPr>
-            <w:tcW w:w="2543" w:type="dxa"/>
-          </w:tcPr>
-          <w:p>
-            <w:pPr>
-              <w:spacing w:before="20" w:after="20"/>
-            </w:pPr>
-            <w:r>
-              <w:rPr>
-                <w:sz w:val="20"/>
-                <w:szCs w:val="20"/>
-              </w:rPr>
-              <w:t xml:space="preserve">Sales-based real earnings management and the cost of debt: Evidence from five ASEAN markets</w:t>
-            </w:r>
-          </w:p>
-        </w:tc>
-        <w:tc>
-          <w:tcPr>
-            <w:tcW w:w="2800" w:type="dxa"/>
-          </w:tcPr>
-          <w:p>
-            <w:pPr>
-              <w:spacing w:before="20" w:after="20"/>
-            </w:pPr>
-            <w:r>
-              <w:rPr>
-                <w:sz w:val="20"/>
-                <w:szCs w:val="20"/>
-              </w:rPr>
-              <w:t xml:space="preserve">Accounting Open</w:t>
-            </w:r>
-          </w:p>
-        </w:tc>
-        <w:tc>
-          <w:tcPr>
-            <w:tcW w:w="923" w:type="dxa"/>
-          </w:tcPr>
-          <w:p>
-            <w:pPr>
-              <w:spacing w:before="20" w:after="20"/>
-            </w:pPr>
-            <w:r>
-              <w:rPr>
-                <w:sz w:val="20"/>
-                <w:szCs w:val="20"/>
-              </w:rPr>
-              <w:t xml:space="preserve">Chưa xác định</w:t>
-            </w:r>
-          </w:p>
-        </w:tc>
-        <w:tc>
-          <w:tcPr>
-            <w:tcW w:w="1819" w:type="dxa"/>
-          </w:tcPr>
-          <w:p>
-            <w:pPr>
-              <w:spacing w:before="20" w:after="20"/>
-            </w:pPr>
-            <w:r>
-              <w:rPr>
-                <w:sz w:val="20"/>
-                <w:szCs w:val="20"/>
-              </w:rPr>
-              <w:t xml:space="preserve">With Editor</w:t>
-            </w:r>
-          </w:p>
-        </w:tc>
-      </w:tr>
-    </w:tbl>
-    <w:p>
-      <w:pPr>
-        <w:spacing w:after="60"/>
-      </w:pPr>
-    </w:p>
-    <w:p>
-      <w:pPr>
-        <w:pStyle w:val="Content"/>
-        <w:spacing w:after="120"/>
-        <w:ind w:firstLine="567"/>
-        <w:jc w:val="both"/>
-      </w:pPr>
-      <w:r>
-        <w:t xml:space="preserve">Bài số 1 và bài số 4 gần với đề tài thực tập nhất: bài số 1 áp dụng Black-Litterman trên thị trường cổ phiếu Việt Nam [23], bài số 4 mở rộng sang khung Black-Litterman nghịch đảo kết hợp học máy phân cụm. BL Advisor đưa ý tưởng phân bổ ấy vào một công cụ cho người dùng cuối. Các bài còn lại thuộc mảng thị trường vốn, ngân hàng và kế toán, không liên quan đến mã nguồn của dự án.</w:t>
-      </w:r>
-    </w:p>
-    <w:p>
-      <w:pPr>
-        <w:pStyle w:val="Heading1N"/>
-        <w:pageBreakBefore/>
-        <w:ind w:left="0" w:firstLine="0"/>
-        <w:jc w:val="center"/>
-      </w:pPr>
-      <w:r>
-        <w:t xml:space="preserve">MỤC LỤC</w:t>
+      <w:r>
+        <w:tab/>
+      </w:r>
+      <w:r>
+        <w:t xml:space="preserve">55</w:t>
       </w:r>
     </w:p>
     <w:p>
@@ -3859,22 +3343,13 @@
         <w:pStyle w:val="TOC1"/>
       </w:pPr>
       <w:r>
-        <w:fldChar w:fldCharType="begin"/>
-      </w:r>
-      <w:r>
-        <w:instrText xml:space="preserve"> TOC \o "1-2" \h \z \u </w:instrText>
-      </w:r>
-      <w:r>
-        <w:fldChar w:fldCharType="separate"/>
-      </w:r>
-      <w:r>
-        <w:t xml:space="preserve">THÔNG TIN CHUNG</w:t>
+        <w:t xml:space="preserve">TÀI LIỆU THAM KHẢO</w:t>
       </w:r>
       <w:r>
         <w:tab/>
       </w:r>
       <w:r>
-        <w:t xml:space="preserve">i</w:t>
+        <w:t xml:space="preserve">57</w:t>
       </w:r>
     </w:p>
     <w:p>
@@ -3882,889 +3357,98 @@
         <w:pStyle w:val="TOC1"/>
       </w:pPr>
       <w:r>
-        <w:t xml:space="preserve">THÔNG TIN VỀ HỌC PHẦN THỰC TẬP TỐT NGHIỆP</w:t>
+        <w:t xml:space="preserve">PHỤ LỤC</w:t>
       </w:r>
       <w:r>
         <w:tab/>
       </w:r>
       <w:r>
-        <w:t xml:space="preserve">ii</w:t>
-      </w:r>
-    </w:p>
-    <w:p>
-      <w:pPr>
-        <w:pStyle w:val="TOC1"/>
-      </w:pPr>
-      <w:r>
-        <w:t xml:space="preserve">LỜI CẢM ƠN</w:t>
-      </w:r>
+        <w:t xml:space="preserve">60</w:t>
+      </w:r>
+    </w:p>
+    <w:p>
+      <w:pPr>
+        <w:pStyle w:val="TOC2"/>
+      </w:pPr>
       <w:r>
         <w:tab/>
       </w:r>
       <w:r>
-        <w:t xml:space="preserve">iv</w:t>
-      </w:r>
-    </w:p>
-    <w:p>
-      <w:pPr>
-        <w:pStyle w:val="TOC1"/>
-      </w:pPr>
-      <w:r>
-        <w:t xml:space="preserve">DANH MỤC CÔNG TRÌNH KHOA HỌC CỦA SINH VIÊN</w:t>
+        <w:t xml:space="preserve">Phụ lục A. Cấu trúc thư mục của kho mã</w:t>
       </w:r>
       <w:r>
         <w:tab/>
       </w:r>
       <w:r>
-        <w:t xml:space="preserve">v</w:t>
-      </w:r>
-    </w:p>
-    <w:p>
-      <w:pPr>
-        <w:pStyle w:val="TOC1"/>
-      </w:pPr>
-      <w:r>
-        <w:t xml:space="preserve">MỤC LỤC</w:t>
-      </w:r>
+        <w:t xml:space="preserve">60</w:t>
+      </w:r>
+    </w:p>
+    <w:p>
+      <w:pPr>
+        <w:pStyle w:val="TOC2"/>
+      </w:pPr>
       <w:r>
         <w:tab/>
       </w:r>
       <w:r>
-        <w:t xml:space="preserve">vii</w:t>
-      </w:r>
-    </w:p>
-    <w:p>
-      <w:pPr>
-        <w:pStyle w:val="TOC1"/>
-      </w:pPr>
-      <w:r>
-        <w:t xml:space="preserve">DANH MỤC BẢNG</w:t>
+        <w:t xml:space="preserve">Phụ lục B. Tham số mặc định và giới hạn của endpoint tối ưu hóa</w:t>
       </w:r>
       <w:r>
         <w:tab/>
       </w:r>
       <w:r>
-        <w:t xml:space="preserve">ix</w:t>
-      </w:r>
-    </w:p>
-    <w:p>
-      <w:pPr>
-        <w:pStyle w:val="TOC1"/>
-      </w:pPr>
-      <w:r>
-        <w:t xml:space="preserve">DANH MỤC HÌNH</w:t>
-      </w:r>
+        <w:t xml:space="preserve">60</w:t>
+      </w:r>
+    </w:p>
+    <w:p>
+      <w:pPr>
+        <w:pStyle w:val="TOC2"/>
+      </w:pPr>
       <w:r>
         <w:tab/>
       </w:r>
       <w:r>
-        <w:t xml:space="preserve">x</w:t>
-      </w:r>
-    </w:p>
-    <w:p>
-      <w:pPr>
-        <w:pStyle w:val="TOC1"/>
-      </w:pPr>
-      <w:r>
-        <w:t xml:space="preserve">DANH MỤC TỪ VIẾT TẮT</w:t>
+        <w:t xml:space="preserve">Phụ lục C. Các mục kiểm thử Minor còn mở</w:t>
       </w:r>
       <w:r>
         <w:tab/>
       </w:r>
       <w:r>
-        <w:t xml:space="preserve">xi</w:t>
-      </w:r>
-    </w:p>
-    <w:p>
-      <w:pPr>
-        <w:pStyle w:val="TOC1"/>
-      </w:pPr>
-      <w:r>
-        <w:t xml:space="preserve">TÓM TẮT</w:t>
-      </w:r>
+        <w:t xml:space="preserve">61</w:t>
+      </w:r>
+    </w:p>
+    <w:p>
+      <w:pPr>
+        <w:pStyle w:val="TOC2"/>
+      </w:pPr>
       <w:r>
         <w:tab/>
       </w:r>
       <w:r>
-        <w:t xml:space="preserve">xiii</w:t>
-      </w:r>
-    </w:p>
-    <w:p>
-      <w:pPr>
-        <w:pStyle w:val="TOC1"/>
-      </w:pPr>
-      <w:r>
-        <w:t xml:space="preserve">ABSTRACT</w:t>
+        <w:t xml:space="preserve">Phụ lục D. Danh mục ảnh chụp toàn trang</w:t>
       </w:r>
       <w:r>
         <w:tab/>
       </w:r>
       <w:r>
-        <w:t xml:space="preserve">xiv</w:t>
-      </w:r>
-    </w:p>
-    <w:p>
-      <w:pPr>
-        <w:pStyle w:val="TOC1"/>
-      </w:pPr>
-      <w:r>
-        <w:t xml:space="preserve">PHẦN 1 THÔNG TIN SINH VIÊN, CÔNG TY / ĐƠN VỊ THỰC TẬP, CÁN BỘ HƯỚNG DẪN, GIẢNG VIÊN, TRƯỜNG VÀ KHOA</w:t>
-      </w:r>
+        <w:t xml:space="preserve">61</w:t>
+      </w:r>
+    </w:p>
+    <w:p>
+      <w:pPr>
+        <w:pStyle w:val="TOC2"/>
+      </w:pPr>
       <w:r>
         <w:tab/>
       </w:r>
       <w:r>
-        <w:t xml:space="preserve">1</w:t>
-      </w:r>
-    </w:p>
-    <w:p>
-      <w:pPr>
-        <w:pStyle w:val="TOC2"/>
-      </w:pPr>
-      <w:r>
-        <w:t xml:space="preserve">1.1</w:t>
+        <w:t xml:space="preserve">Phụ lục E. Nhận xét của đơn vị thực tập</w:t>
       </w:r>
       <w:r>
         <w:tab/>
       </w:r>
       <w:r>
-        <w:t xml:space="preserve">Thông tin sinh viên</w:t>
-      </w:r>
-      <w:r>
-        <w:tab/>
-      </w:r>
-      <w:r>
-        <w:t xml:space="preserve">1</w:t>
-      </w:r>
-    </w:p>
-    <w:p>
-      <w:pPr>
-        <w:pStyle w:val="TOC2"/>
-      </w:pPr>
-      <w:r>
-        <w:t xml:space="preserve">1.2</w:t>
-      </w:r>
-      <w:r>
-        <w:tab/>
-      </w:r>
-      <w:r>
-        <w:t xml:space="preserve">Thông tin công ty / đơn vị thực tập</w:t>
-      </w:r>
-      <w:r>
-        <w:tab/>
-      </w:r>
-      <w:r>
-        <w:t xml:space="preserve">1</w:t>
-      </w:r>
-    </w:p>
-    <w:p>
-      <w:pPr>
-        <w:pStyle w:val="TOC2"/>
-      </w:pPr>
-      <w:r>
-        <w:t xml:space="preserve">1.3</w:t>
-      </w:r>
-      <w:r>
-        <w:tab/>
-      </w:r>
-      <w:r>
-        <w:t xml:space="preserve">Thông tin Học viện Công nghệ Bưu chính Viễn thông</w:t>
-      </w:r>
-      <w:r>
-        <w:tab/>
-      </w:r>
-      <w:r>
-        <w:t xml:space="preserve">1</w:t>
-      </w:r>
-    </w:p>
-    <w:p>
-      <w:pPr>
-        <w:pStyle w:val="TOC2"/>
-      </w:pPr>
-      <w:r>
-        <w:t xml:space="preserve">1.4</w:t>
-      </w:r>
-      <w:r>
-        <w:tab/>
-      </w:r>
-      <w:r>
-        <w:t xml:space="preserve">Thông tin Khoa Công nghệ thông tin 1</w:t>
-      </w:r>
-      <w:r>
-        <w:tab/>
-      </w:r>
-      <w:r>
-        <w:t xml:space="preserve">2</w:t>
-      </w:r>
-    </w:p>
-    <w:p>
-      <w:pPr>
-        <w:pStyle w:val="TOC1"/>
-      </w:pPr>
-      <w:r>
-        <w:t xml:space="preserve">PHẦN 2 KẾ HOẠCH THỰC TẬP</w:t>
-      </w:r>
-      <w:r>
-        <w:tab/>
-      </w:r>
-      <w:r>
-        <w:t xml:space="preserve">3</w:t>
-      </w:r>
-    </w:p>
-    <w:p>
-      <w:pPr>
-        <w:pStyle w:val="TOC1"/>
-      </w:pPr>
-      <w:r>
-        <w:t xml:space="preserve">PHẦN 3 GIỚI THIỆU ĐƠN VỊ THỰC TẬP</w:t>
-      </w:r>
-      <w:r>
-        <w:tab/>
-      </w:r>
-      <w:r>
-        <w:t xml:space="preserve">6</w:t>
-      </w:r>
-    </w:p>
-    <w:p>
-      <w:pPr>
-        <w:pStyle w:val="TOC2"/>
-      </w:pPr>
-      <w:r>
-        <w:t xml:space="preserve">3.1</w:t>
-      </w:r>
-      <w:r>
-        <w:tab/>
-      </w:r>
-      <w:r>
-        <w:t xml:space="preserve">Thông tin doanh nghiệp</w:t>
-      </w:r>
-      <w:r>
-        <w:tab/>
-      </w:r>
-      <w:r>
-        <w:t xml:space="preserve">6</w:t>
-      </w:r>
-    </w:p>
-    <w:p>
-      <w:pPr>
-        <w:pStyle w:val="TOC2"/>
-      </w:pPr>
-      <w:r>
-        <w:t xml:space="preserve">3.2</w:t>
-      </w:r>
-      <w:r>
-        <w:tab/>
-      </w:r>
-      <w:r>
-        <w:t xml:space="preserve">Lịch sử hình thành và phát triển của doanh nghiệp</w:t>
-      </w:r>
-      <w:r>
-        <w:tab/>
-      </w:r>
-      <w:r>
-        <w:t xml:space="preserve">6</w:t>
-      </w:r>
-    </w:p>
-    <w:p>
-      <w:pPr>
-        <w:pStyle w:val="TOC2"/>
-      </w:pPr>
-      <w:r>
-        <w:t xml:space="preserve">3.3</w:t>
-      </w:r>
-      <w:r>
-        <w:tab/>
-      </w:r>
-      <w:r>
-        <w:t xml:space="preserve">Các lĩnh vực hoạt động, dịch vụ, hoặc sản phẩm của doanh nghiệp</w:t>
-      </w:r>
-      <w:r>
-        <w:tab/>
-      </w:r>
-      <w:r>
-        <w:t xml:space="preserve">7</w:t>
-      </w:r>
-    </w:p>
-    <w:p>
-      <w:pPr>
-        <w:pStyle w:val="TOC2"/>
-      </w:pPr>
-      <w:r>
-        <w:t xml:space="preserve">3.4</w:t>
-      </w:r>
-      <w:r>
-        <w:tab/>
-      </w:r>
-      <w:r>
-        <w:t xml:space="preserve">Những đóng góp của doanh nghiệp trong lĩnh vực chuyên môn</w:t>
-      </w:r>
-      <w:r>
-        <w:tab/>
-      </w:r>
-      <w:r>
-        <w:t xml:space="preserve">8</w:t>
-      </w:r>
-    </w:p>
-    <w:p>
-      <w:pPr>
-        <w:pStyle w:val="TOC2"/>
-      </w:pPr>
-      <w:r>
-        <w:t xml:space="preserve">3.5</w:t>
-      </w:r>
-      <w:r>
-        <w:tab/>
-      </w:r>
-      <w:r>
-        <w:t xml:space="preserve">Cơ cấu tổ chức và vị trí của sinh viên</w:t>
-      </w:r>
-      <w:r>
-        <w:tab/>
-      </w:r>
-      <w:r>
-        <w:t xml:space="preserve">9</w:t>
-      </w:r>
-    </w:p>
-    <w:p>
-      <w:pPr>
-        <w:pStyle w:val="TOC1"/>
-      </w:pPr>
-      <w:r>
-        <w:t xml:space="preserve">PHẦN 4 NHẬT KÝ THỰC TẬP</w:t>
-      </w:r>
-      <w:r>
-        <w:tab/>
-      </w:r>
-      <w:r>
-        <w:t xml:space="preserve">11</w:t>
-      </w:r>
-    </w:p>
-    <w:p>
-      <w:pPr>
-        <w:pStyle w:val="TOC2"/>
-      </w:pPr>
-      <w:r>
-        <w:tab/>
-      </w:r>
-      <w:r>
-        <w:t xml:space="preserve">Tuần 1 (từ ngày 29/06/2026 đến ngày 05/07/2026)</w:t>
-      </w:r>
-      <w:r>
-        <w:tab/>
-      </w:r>
-      <w:r>
-        <w:t xml:space="preserve">11</w:t>
-      </w:r>
-    </w:p>
-    <w:p>
-      <w:pPr>
-        <w:pStyle w:val="TOC2"/>
-      </w:pPr>
-      <w:r>
-        <w:tab/>
-      </w:r>
-      <w:r>
-        <w:t xml:space="preserve">Tuần 2 (từ ngày 06/07/2026 đến ngày 12/07/2026)</w:t>
-      </w:r>
-      <w:r>
-        <w:tab/>
-      </w:r>
-      <w:r>
-        <w:t xml:space="preserve">11</w:t>
-      </w:r>
-    </w:p>
-    <w:p>
-      <w:pPr>
-        <w:pStyle w:val="TOC2"/>
-      </w:pPr>
-      <w:r>
-        <w:tab/>
-      </w:r>
-      <w:r>
-        <w:t xml:space="preserve">Tuần 3 (từ ngày 13/07/2026 đến ngày 19/07/2026)</w:t>
-      </w:r>
-      <w:r>
-        <w:tab/>
-      </w:r>
-      <w:r>
-        <w:t xml:space="preserve">12</w:t>
-      </w:r>
-    </w:p>
-    <w:p>
-      <w:pPr>
-        <w:pStyle w:val="TOC2"/>
-      </w:pPr>
-      <w:r>
-        <w:tab/>
-      </w:r>
-      <w:r>
-        <w:t xml:space="preserve">Tuần 4 (từ ngày 20/07/2026 đến ngày 26/07/2026)</w:t>
-      </w:r>
-      <w:r>
-        <w:tab/>
-      </w:r>
-      <w:r>
-        <w:t xml:space="preserve">13</w:t>
-      </w:r>
-    </w:p>
-    <w:p>
-      <w:pPr>
-        <w:pStyle w:val="TOC2"/>
-      </w:pPr>
-      <w:r>
-        <w:tab/>
-      </w:r>
-      <w:r>
-        <w:t xml:space="preserve">Tuần 5 (từ ngày 27/07/2026 đến ngày 02/08/2026)</w:t>
-      </w:r>
-      <w:r>
-        <w:tab/>
-      </w:r>
-      <w:r>
-        <w:t xml:space="preserve">14</w:t>
-      </w:r>
-    </w:p>
-    <w:p>
-      <w:pPr>
-        <w:pStyle w:val="TOC2"/>
-      </w:pPr>
-      <w:r>
-        <w:tab/>
-      </w:r>
-      <w:r>
-        <w:t xml:space="preserve">Tuần 6 (từ ngày 03/08/2026 đến ngày 09/08/2026)</w:t>
-      </w:r>
-      <w:r>
-        <w:tab/>
-      </w:r>
-      <w:r>
-        <w:t xml:space="preserve">14</w:t>
-      </w:r>
-    </w:p>
-    <w:p>
-      <w:pPr>
-        <w:pStyle w:val="TOC2"/>
-      </w:pPr>
-      <w:r>
-        <w:tab/>
-      </w:r>
-      <w:r>
-        <w:t xml:space="preserve">Tuần 7 (từ ngày 10/08/2026 đến ngày 16/08/2026)</w:t>
-      </w:r>
-      <w:r>
-        <w:tab/>
-      </w:r>
-      <w:r>
-        <w:t xml:space="preserve">15</w:t>
-      </w:r>
-    </w:p>
-    <w:p>
-      <w:pPr>
-        <w:pStyle w:val="TOC2"/>
-      </w:pPr>
-      <w:r>
-        <w:tab/>
-      </w:r>
-      <w:r>
-        <w:t xml:space="preserve">Tuần 8 (từ ngày 17/08/2026 đến ngày 23/08/2026)</w:t>
-      </w:r>
-      <w:r>
-        <w:tab/>
-      </w:r>
-      <w:r>
-        <w:t xml:space="preserve">16</w:t>
-      </w:r>
-    </w:p>
-    <w:p>
-      <w:pPr>
-        <w:pStyle w:val="TOC2"/>
-      </w:pPr>
-      <w:r>
-        <w:tab/>
-      </w:r>
-      <w:r>
-        <w:t xml:space="preserve">Tuần 9 (từ ngày 24/08/2026 đến ngày 30/08/2026)</w:t>
-      </w:r>
-      <w:r>
-        <w:tab/>
-      </w:r>
-      <w:r>
-        <w:t xml:space="preserve">17</w:t>
-      </w:r>
-    </w:p>
-    <w:p>
-      <w:pPr>
-        <w:pStyle w:val="TOC2"/>
-      </w:pPr>
-      <w:r>
-        <w:tab/>
-      </w:r>
-      <w:r>
-        <w:t xml:space="preserve">Tuần 10 (từ ngày 31/08/2026 đến ngày 06/09/2026)</w:t>
-      </w:r>
-      <w:r>
-        <w:tab/>
-      </w:r>
-      <w:r>
-        <w:t xml:space="preserve">17</w:t>
-      </w:r>
-    </w:p>
-    <w:p>
-      <w:pPr>
-        <w:pStyle w:val="TOC2"/>
-      </w:pPr>
-      <w:r>
-        <w:tab/>
-      </w:r>
-      <w:r>
-        <w:t xml:space="preserve">Tuần 11 (từ ngày 07/09/2026 đến ngày 13/09/2026)</w:t>
-      </w:r>
-      <w:r>
-        <w:tab/>
-      </w:r>
-      <w:r>
-        <w:t xml:space="preserve">18</w:t>
-      </w:r>
-    </w:p>
-    <w:p>
-      <w:pPr>
-        <w:pStyle w:val="TOC2"/>
-      </w:pPr>
-      <w:r>
-        <w:tab/>
-      </w:r>
-      <w:r>
-        <w:t xml:space="preserve">Tuần 12 (từ ngày 14/09/2026 đến ngày 20/09/2026)</w:t>
-      </w:r>
-      <w:r>
-        <w:tab/>
-      </w:r>
-      <w:r>
-        <w:t xml:space="preserve">19</w:t>
-      </w:r>
-    </w:p>
-    <w:p>
-      <w:pPr>
-        <w:pStyle w:val="TOC2"/>
-      </w:pPr>
-      <w:r>
-        <w:tab/>
-      </w:r>
-      <w:r>
-        <w:t xml:space="preserve">Tuần 13 (từ ngày 21/09/2026 đến ngày 27/09/2026)</w:t>
-      </w:r>
-      <w:r>
-        <w:tab/>
-      </w:r>
-      <w:r>
-        <w:t xml:space="preserve">20</w:t>
-      </w:r>
-    </w:p>
-    <w:p>
-      <w:pPr>
-        <w:pStyle w:val="TOC1"/>
-      </w:pPr>
-      <w:r>
-        <w:t xml:space="preserve">PHẦN 5 BÁO CÁO PROJECT THỰC TẬP</w:t>
-      </w:r>
-      <w:r>
-        <w:tab/>
-      </w:r>
-      <w:r>
-        <w:t xml:space="preserve">21</w:t>
-      </w:r>
-    </w:p>
-    <w:p>
-      <w:pPr>
-        <w:pStyle w:val="TOC2"/>
-      </w:pPr>
-      <w:r>
-        <w:t xml:space="preserve">5.1</w:t>
-      </w:r>
-      <w:r>
-        <w:tab/>
-      </w:r>
-      <w:r>
-        <w:t xml:space="preserve">Đặt vấn đề</w:t>
-      </w:r>
-      <w:r>
-        <w:tab/>
-      </w:r>
-      <w:r>
-        <w:t xml:space="preserve">21</w:t>
-      </w:r>
-    </w:p>
-    <w:p>
-      <w:pPr>
-        <w:pStyle w:val="TOC2"/>
-      </w:pPr>
-      <w:r>
-        <w:t xml:space="preserve">5.2</w:t>
-      </w:r>
-      <w:r>
-        <w:tab/>
-      </w:r>
-      <w:r>
-        <w:t xml:space="preserve">Khảo sát nghiên cứu liên quan và cơ sở lý thuyết</w:t>
-      </w:r>
-      <w:r>
-        <w:tab/>
-      </w:r>
-      <w:r>
-        <w:t xml:space="preserve">23</w:t>
-      </w:r>
-    </w:p>
-    <w:p>
-      <w:pPr>
-        <w:pStyle w:val="TOC2"/>
-      </w:pPr>
-      <w:r>
-        <w:t xml:space="preserve">5.3</w:t>
-      </w:r>
-      <w:r>
-        <w:tab/>
-      </w:r>
-      <w:r>
-        <w:t xml:space="preserve">Phân tích và thiết kế hệ thống</w:t>
-      </w:r>
-      <w:r>
-        <w:tab/>
-      </w:r>
-      <w:r>
-        <w:t xml:space="preserve">27</w:t>
-      </w:r>
-    </w:p>
-    <w:p>
-      <w:pPr>
-        <w:pStyle w:val="TOC2"/>
-      </w:pPr>
-      <w:r>
-        <w:t xml:space="preserve">5.4</w:t>
-      </w:r>
-      <w:r>
-        <w:tab/>
-      </w:r>
-      <w:r>
-        <w:t xml:space="preserve">Cài đặt</w:t>
-      </w:r>
-      <w:r>
-        <w:tab/>
-      </w:r>
-      <w:r>
-        <w:t xml:space="preserve">32</w:t>
-      </w:r>
-    </w:p>
-    <w:p>
-      <w:pPr>
-        <w:pStyle w:val="TOC2"/>
-      </w:pPr>
-      <w:r>
-        <w:t xml:space="preserve">5.5</w:t>
-      </w:r>
-      <w:r>
-        <w:tab/>
-      </w:r>
-      <w:r>
-        <w:t xml:space="preserve">Kiểm thử và đánh giá</w:t>
-      </w:r>
-      <w:r>
-        <w:tab/>
-      </w:r>
-      <w:r>
-        <w:t xml:space="preserve">36</w:t>
-      </w:r>
-    </w:p>
-    <w:p>
-      <w:pPr>
-        <w:pStyle w:val="TOC2"/>
-      </w:pPr>
-      <w:r>
-        <w:t xml:space="preserve">5.6</w:t>
-      </w:r>
-      <w:r>
-        <w:tab/>
-      </w:r>
-      <w:r>
-        <w:t xml:space="preserve">Hướng dẫn sử dụng và minh họa chức năng</w:t>
-      </w:r>
-      <w:r>
-        <w:tab/>
-      </w:r>
-      <w:r>
-        <w:t xml:space="preserve">40</w:t>
-      </w:r>
-    </w:p>
-    <w:p>
-      <w:pPr>
-        <w:pStyle w:val="TOC2"/>
-      </w:pPr>
-      <w:r>
-        <w:t xml:space="preserve">5.7</w:t>
-      </w:r>
-      <w:r>
-        <w:tab/>
-      </w:r>
-      <w:r>
-        <w:t xml:space="preserve">Thảo luận, hạn chế và hướng phát triển</w:t>
-      </w:r>
-      <w:r>
-        <w:tab/>
-      </w:r>
-      <w:r>
-        <w:t xml:space="preserve">51</w:t>
-      </w:r>
-    </w:p>
-    <w:p>
-      <w:pPr>
-        <w:pStyle w:val="TOC2"/>
-      </w:pPr>
-      <w:r>
-        <w:t xml:space="preserve">5.8</w:t>
-      </w:r>
-      <w:r>
-        <w:tab/>
-      </w:r>
-      <w:r>
-        <w:t xml:space="preserve">Kết luận</w:t>
-      </w:r>
-      <w:r>
-        <w:tab/>
-      </w:r>
-      <w:r>
-        <w:t xml:space="preserve">53</w:t>
-      </w:r>
-    </w:p>
-    <w:p>
-      <w:pPr>
-        <w:pStyle w:val="TOC2"/>
-      </w:pPr>
-      <w:r>
-        <w:t xml:space="preserve">5.9</w:t>
-      </w:r>
-      <w:r>
-        <w:tab/>
-      </w:r>
-      <w:r>
-        <w:t xml:space="preserve">Tuyên bố</w:t>
-      </w:r>
-      <w:r>
-        <w:tab/>
-      </w:r>
-      <w:r>
-        <w:t xml:space="preserve">53</w:t>
-      </w:r>
-    </w:p>
-    <w:p>
-      <w:pPr>
-        <w:pStyle w:val="TOC1"/>
-      </w:pPr>
-      <w:r>
-        <w:t xml:space="preserve">TÀI LIỆU THAM KHẢO</w:t>
-      </w:r>
-      <w:r>
-        <w:tab/>
-      </w:r>
-      <w:r>
-        <w:t xml:space="preserve">55</w:t>
-      </w:r>
-    </w:p>
-    <w:p>
-      <w:pPr>
-        <w:pStyle w:val="TOC1"/>
-      </w:pPr>
-      <w:r>
-        <w:t xml:space="preserve">PHỤ LỤC</w:t>
-      </w:r>
-      <w:r>
-        <w:tab/>
-      </w:r>
-      <w:r>
-        <w:t xml:space="preserve">58</w:t>
-      </w:r>
-    </w:p>
-    <w:p>
-      <w:pPr>
-        <w:pStyle w:val="TOC2"/>
-      </w:pPr>
-      <w:r>
-        <w:tab/>
-      </w:r>
-      <w:r>
-        <w:t xml:space="preserve">Phụ lục A. Cấu trúc thư mục của kho mã</w:t>
-      </w:r>
-      <w:r>
-        <w:tab/>
-      </w:r>
-      <w:r>
-        <w:t xml:space="preserve">58</w:t>
-      </w:r>
-    </w:p>
-    <w:p>
-      <w:pPr>
-        <w:pStyle w:val="TOC2"/>
-      </w:pPr>
-      <w:r>
-        <w:tab/>
-      </w:r>
-      <w:r>
-        <w:t xml:space="preserve">Phụ lục B. Tham số mặc định và giới hạn của endpoint tối ưu hóa</w:t>
-      </w:r>
-      <w:r>
-        <w:tab/>
-      </w:r>
-      <w:r>
-        <w:t xml:space="preserve">58</w:t>
-      </w:r>
-    </w:p>
-    <w:p>
-      <w:pPr>
-        <w:pStyle w:val="TOC2"/>
-      </w:pPr>
-      <w:r>
-        <w:tab/>
-      </w:r>
-      <w:r>
-        <w:t xml:space="preserve">Phụ lục C. Các mục kiểm thử Minor còn mở</w:t>
-      </w:r>
-      <w:r>
-        <w:tab/>
-      </w:r>
-      <w:r>
-        <w:t xml:space="preserve">59</w:t>
-      </w:r>
-    </w:p>
-    <w:p>
-      <w:pPr>
-        <w:pStyle w:val="TOC2"/>
-      </w:pPr>
-      <w:r>
-        <w:tab/>
-      </w:r>
-      <w:r>
-        <w:t xml:space="preserve">Phụ lục D. Danh mục ảnh chụp toàn trang</w:t>
-      </w:r>
-      <w:r>
-        <w:tab/>
-      </w:r>
-      <w:r>
-        <w:t xml:space="preserve">59</w:t>
-      </w:r>
-    </w:p>
-    <w:p>
-      <w:pPr>
-        <w:pStyle w:val="TOC2"/>
-      </w:pPr>
-      <w:r>
-        <w:tab/>
-      </w:r>
-      <w:r>
-        <w:t xml:space="preserve">Phụ lục E. Nhận xét của đơn vị thực tập</w:t>
-      </w:r>
-      <w:r>
-        <w:tab/>
-      </w:r>
-      <w:r>
-        <w:t xml:space="preserve">59</w:t>
+        <w:t xml:space="preserve">61</w:t>
       </w:r>
       <w:r>
         <w:fldChar w:fldCharType="end"/>
@@ -4797,13 +3481,13 @@
         <w:fldChar w:fldCharType="separate"/>
       </w:r>
       <w:r>
-        <w:t xml:space="preserve">Bảng 0.1. Sản phẩm khoa học của sinh viên</w:t>
+        <w:t xml:space="preserve">Bảng 2.1. Kế hoạch thực tập theo tuần</w:t>
       </w:r>
       <w:r>
         <w:tab/>
       </w:r>
       <w:r>
-        <w:t xml:space="preserve">v</w:t>
+        <w:t xml:space="preserve">3</w:t>
       </w:r>
     </w:p>
     <w:p>
@@ -4812,13 +3496,13 @@
         <w:ind w:left="1134" w:hanging="1134"/>
       </w:pPr>
       <w:r>
-        <w:t xml:space="preserve">Bảng 2.1. Kế hoạch thực tập theo tuần</w:t>
+        <w:t xml:space="preserve">Bảng 3.1. Thông tin pháp lý và quy mô của ITMV</w:t>
       </w:r>
       <w:r>
         <w:tab/>
       </w:r>
       <w:r>
-        <w:t xml:space="preserve">3</w:t>
+        <w:t xml:space="preserve">6</w:t>
       </w:r>
     </w:p>
     <w:p>
@@ -4827,13 +3511,13 @@
         <w:ind w:left="1134" w:hanging="1134"/>
       </w:pPr>
       <w:r>
-        <w:t xml:space="preserve">Bảng 3.1. Thông tin pháp lý và quy mô của ITMV</w:t>
+        <w:t xml:space="preserve">Bảng 3.2. Sản phẩm và điều kiện sản xuất theo nhà máy</w:t>
       </w:r>
       <w:r>
         <w:tab/>
       </w:r>
       <w:r>
-        <w:t xml:space="preserve">6</w:t>
+        <w:t xml:space="preserve">8</w:t>
       </w:r>
     </w:p>
     <w:p>
@@ -4842,13 +3526,13 @@
         <w:ind w:left="1134" w:hanging="1134"/>
       </w:pPr>
       <w:r>
-        <w:t xml:space="preserve">Bảng 3.2. Sản phẩm và điều kiện sản xuất theo nhà máy</w:t>
+        <w:t xml:space="preserve">Bảng 5.1. Đối chiếu nhu cầu, khoảng trống và cách giải quyết của dự án</w:t>
       </w:r>
       <w:r>
         <w:tab/>
       </w:r>
       <w:r>
-        <w:t xml:space="preserve">8</w:t>
+        <w:t xml:space="preserve">26</w:t>
       </w:r>
     </w:p>
     <w:p>
@@ -4857,13 +3541,13 @@
         <w:ind w:left="1134" w:hanging="1134"/>
       </w:pPr>
       <w:r>
-        <w:t xml:space="preserve">Bảng 5.1. Đối chiếu nhu cầu, khoảng trống và cách giải quyết của dự án</w:t>
+        <w:t xml:space="preserve">Bảng 5.2. Yêu cầu chức năng của phần bổ sung</w:t>
       </w:r>
       <w:r>
         <w:tab/>
       </w:r>
       <w:r>
-        <w:t xml:space="preserve">26</w:t>
+        <w:t xml:space="preserve">27</w:t>
       </w:r>
     </w:p>
     <w:p>
@@ -4872,13 +3556,13 @@
         <w:ind w:left="1134" w:hanging="1134"/>
       </w:pPr>
       <w:r>
-        <w:t xml:space="preserve">Bảng 5.2. Yêu cầu chức năng của phần bổ sung</w:t>
+        <w:t xml:space="preserve">Bảng 5.3. Yêu cầu phi chức năng</w:t>
       </w:r>
       <w:r>
         <w:tab/>
       </w:r>
       <w:r>
-        <w:t xml:space="preserve">27</w:t>
+        <w:t xml:space="preserve">28</w:t>
       </w:r>
     </w:p>
     <w:p>
@@ -4887,13 +3571,13 @@
         <w:ind w:left="1134" w:hanging="1134"/>
       </w:pPr>
       <w:r>
-        <w:t xml:space="preserve">Bảng 5.3. Yêu cầu phi chức năng</w:t>
+        <w:t xml:space="preserve">Bảng 5.4. Công nghệ sử dụng</w:t>
       </w:r>
       <w:r>
         <w:tab/>
       </w:r>
       <w:r>
-        <w:t xml:space="preserve">28</w:t>
+        <w:t xml:space="preserve">29</w:t>
       </w:r>
     </w:p>
     <w:p>
@@ -4902,13 +3586,13 @@
         <w:ind w:left="1134" w:hanging="1134"/>
       </w:pPr>
       <w:r>
-        <w:t xml:space="preserve">Bảng 5.4. Công nghệ sử dụng</w:t>
+        <w:t xml:space="preserve">Bảng 5.5. Các endpoint của phần bổ sung</w:t>
       </w:r>
       <w:r>
         <w:tab/>
       </w:r>
       <w:r>
-        <w:t xml:space="preserve">29</w:t>
+        <w:t xml:space="preserve">31</w:t>
       </w:r>
     </w:p>
     <w:p>
@@ -4917,13 +3601,13 @@
         <w:ind w:left="1134" w:hanging="1134"/>
       </w:pPr>
       <w:r>
-        <w:t xml:space="preserve">Bảng 5.5. Các endpoint của phần bổ sung</w:t>
+        <w:t xml:space="preserve">Bảng 5.6. Các tệp chính của phần bổ sung</w:t>
       </w:r>
       <w:r>
         <w:tab/>
       </w:r>
       <w:r>
-        <w:t xml:space="preserve">31</w:t>
+        <w:t xml:space="preserve">32</w:t>
       </w:r>
     </w:p>
     <w:p>
@@ -4932,13 +3616,13 @@
         <w:ind w:left="1134" w:hanging="1134"/>
       </w:pPr>
       <w:r>
-        <w:t xml:space="preserve">Bảng 5.6. Các tệp chính của phần bổ sung</w:t>
+        <w:t xml:space="preserve">Bảng 5.7. Quy mô dữ liệu demo</w:t>
       </w:r>
       <w:r>
         <w:tab/>
       </w:r>
       <w:r>
-        <w:t xml:space="preserve">32</w:t>
+        <w:t xml:space="preserve">36</w:t>
       </w:r>
     </w:p>
     <w:p>
@@ -4947,13 +3631,13 @@
         <w:ind w:left="1134" w:hanging="1134"/>
       </w:pPr>
       <w:r>
-        <w:t xml:space="preserve">Bảng 5.7. Quy mô dữ liệu demo</w:t>
+        <w:t xml:space="preserve">Bảng 5.8. Kết quả kiểm thử tự động</w:t>
       </w:r>
       <w:r>
         <w:tab/>
       </w:r>
       <w:r>
-        <w:t xml:space="preserve">36</w:t>
+        <w:t xml:space="preserve">37</w:t>
       </w:r>
     </w:p>
     <w:p>
@@ -4962,13 +3646,13 @@
         <w:ind w:left="1134" w:hanging="1134"/>
       </w:pPr>
       <w:r>
-        <w:t xml:space="preserve">Bảng 5.8. Kết quả kiểm thử tự động</w:t>
+        <w:t xml:space="preserve">Bảng 5.9. So sánh các danh mục trên dữ liệu trong mẫu (tài khoản demo-user-12, tám khoản nắm giữ lớn nhất, hai năm dữ liệu mô phỏng, tỷ trọng tối đa 40%)</w:t>
       </w:r>
       <w:r>
         <w:tab/>
       </w:r>
       <w:r>
-        <w:t xml:space="preserve">37</w:t>
+        <w:t xml:space="preserve">39</w:t>
       </w:r>
     </w:p>
     <w:p>
@@ -4977,7 +3661,7 @@
         <w:ind w:left="1134" w:hanging="1134"/>
       </w:pPr>
       <w:r>
-        <w:t xml:space="preserve">Bảng 5.9. So sánh các danh mục trên dữ liệu trong mẫu (tài khoản demo-user-12, tám khoản nắm giữ lớn nhất, hai năm dữ liệu mô phỏng, tỷ trọng tối đa 40%)</w:t>
+        <w:t xml:space="preserve">Bảng 5.10. Kết quả backtest walk-forward ngoài mẫu (cửa sổ 252 ngày, cân bằng lại mỗi 63 ngày, 5 lần)</w:t>
       </w:r>
       <w:r>
         <w:tab/>
@@ -4992,13 +3676,13 @@
         <w:ind w:left="1134" w:hanging="1134"/>
       </w:pPr>
       <w:r>
-        <w:t xml:space="preserve">Bảng 5.10. Kết quả backtest walk-forward ngoài mẫu (cửa sổ 252 ngày, cân bằng lại mỗi 63 ngày, 5 lần)</w:t>
+        <w:t xml:space="preserve">Bảng C.1. Sản phẩm khoa học của sinh viên</w:t>
       </w:r>
       <w:r>
         <w:tab/>
       </w:r>
       <w:r>
-        <w:t xml:space="preserve">39</w:t>
+        <w:t xml:space="preserve">55</w:t>
       </w:r>
     </w:p>
     <w:p>
@@ -5013,7 +3697,7 @@
         <w:tab/>
       </w:r>
       <w:r>
-        <w:t xml:space="preserve">58</w:t>
+        <w:t xml:space="preserve">60</w:t>
       </w:r>
     </w:p>
     <w:p>
@@ -5028,7 +3712,7 @@
         <w:tab/>
       </w:r>
       <w:r>
-        <w:t xml:space="preserve">59</w:t>
+        <w:t xml:space="preserve">61</w:t>
       </w:r>
       <w:r>
         <w:fldChar w:fldCharType="end"/>
@@ -31923,6 +30607,1322 @@
       </w:pPr>
       <w:r>
         <w:t xml:space="preserve">Việc dùng công cụ trí tuệ nhân tạo (AI). Sinh viên dùng trợ lý AI Claude (Anthropic) để hỗ trợ viết mã, viết kiểm thử, chụp ảnh giao diện và soạn thảo báo cáo. Sinh viên đã đọc, chạy và kiểm tra kết quả, quyết định phạm vi và nội dung, và chịu trách nhiệm về toàn bộ báo cáo và mã nguồn. Các số liệu trong báo cáo lấy từ các lần chạy kiểm thử và đo thực tế.</w:t>
+      </w:r>
+    </w:p>
+    <w:p>
+      <w:pPr>
+        <w:pStyle w:val="Heading1N"/>
+        <w:keepNext/>
+        <w:pageBreakBefore/>
+        <w:ind w:left="0" w:firstLine="0"/>
+        <w:jc w:val="center"/>
+      </w:pPr>
+      <w:r>
+        <w:t xml:space="preserve">DANH MỤC CÔNG TRÌNH KHOA HỌC CỦA SINH VIÊN</w:t>
+      </w:r>
+    </w:p>
+    <w:p>
+      <w:pPr>
+        <w:pStyle w:val="Content"/>
+        <w:spacing w:after="120"/>
+        <w:ind w:firstLine="567"/>
+        <w:jc w:val="both"/>
+      </w:pPr>
+      <w:r>
+        <w:t xml:space="preserve">Ngoài dự án thực tập, sinh viên là tác giả liên hệ của 12 bản thảo nghiên cứu về tài chính, ngân hàng và quản trị doanh nghiệp. Bảng C.1 liệt kê các bản thảo theo mức độ tiến triển, lấy từ hồ sơ công bố trong tệp README của kho mã và hồ sơ ORCID (0009-0008-3307-6569). Hàng in đậm là bài đã công bố, đã được duyệt đăng hoặc đã sửa xong vòng 2, gồm cả bài có nội dung nối trực tiếp với dự án. Dấu * chỉ tác giả liên hệ, et al. thay cho danh sách đồng tác giả. Chỉ hai bài đầu là công bố chính thức, các bài còn lại có thể thay đổi sau phản biện.</w:t>
+      </w:r>
+    </w:p>
+    <w:p>
+      <w:pPr>
+        <w:pStyle w:val="Heading4"/>
+        <w:keepNext/>
+        <w:numPr>
+          <w:ilvl w:val="0"/>
+          <w:numId w:val="0"/>
+        </w:numPr>
+        <w:spacing w:before="160" w:after="60"/>
+        <w:ind w:left="0" w:firstLine="0"/>
+        <w:jc w:val="center"/>
+      </w:pPr>
+      <w:r>
+        <w:rPr>
+          <w:b/>
+          <w:bCs/>
+          <w:i w:val="0"/>
+          <w:iCs w:val="0"/>
+          <w:sz w:val="24"/>
+          <w:szCs w:val="24"/>
+        </w:rPr>
+        <w:t xml:space="preserve">Bảng C.1. Sản phẩm khoa học của sinh viên</w:t>
+      </w:r>
+    </w:p>
+    <w:tbl>
+      <w:tblPr>
+        <w:tblW w:w="8788" w:type="dxa"/>
+        <w:tblBorders>
+          <w:top w:val="single" w:sz="4" w:space="0" w:color="808080"/>
+          <w:left w:val="single" w:sz="4" w:space="0" w:color="808080"/>
+          <w:bottom w:val="single" w:sz="4" w:space="0" w:color="808080"/>
+          <w:right w:val="single" w:sz="4" w:space="0" w:color="808080"/>
+          <w:insideH w:val="single" w:sz="4" w:space="0" w:color="808080"/>
+          <w:insideV w:val="single" w:sz="4" w:space="0" w:color="808080"/>
+        </w:tblBorders>
+        <w:tblLayout w:type="fixed"/>
+        <w:tblCellMar>
+          <w:top w:w="40" w:type="dxa"/>
+          <w:left w:w="80" w:type="dxa"/>
+          <w:bottom w:w="40" w:type="dxa"/>
+          <w:right w:w="80" w:type="dxa"/>
+        </w:tblCellMar>
+      </w:tblPr>
+      <w:tblGrid>
+        <w:gridCol w:w="703"/>
+        <w:gridCol w:w="2543"/>
+        <w:gridCol w:w="2800"/>
+        <w:gridCol w:w="923"/>
+        <w:gridCol w:w="1819"/>
+      </w:tblGrid>
+      <w:tr>
+        <w:trPr>
+          <w:cantSplit/>
+          <w:tblHeader/>
+        </w:trPr>
+        <w:tc>
+          <w:tcPr>
+            <w:tcW w:w="703" w:type="dxa"/>
+          </w:tcPr>
+          <w:p>
+            <w:pPr>
+              <w:spacing w:before="20" w:after="20"/>
+              <w:jc w:val="center"/>
+            </w:pPr>
+            <w:r>
+              <w:rPr>
+                <w:b/>
+                <w:bCs/>
+                <w:sz w:val="20"/>
+                <w:szCs w:val="20"/>
+              </w:rPr>
+              <w:t xml:space="preserve">STT</w:t>
+            </w:r>
+          </w:p>
+        </w:tc>
+        <w:tc>
+          <w:tcPr>
+            <w:tcW w:w="2543" w:type="dxa"/>
+          </w:tcPr>
+          <w:p>
+            <w:pPr>
+              <w:spacing w:before="20" w:after="20"/>
+              <w:jc w:val="center"/>
+            </w:pPr>
+            <w:r>
+              <w:rPr>
+                <w:b/>
+                <w:bCs/>
+                <w:sz w:val="20"/>
+                <w:szCs w:val="20"/>
+              </w:rPr>
+              <w:t xml:space="preserve">Tên bài</w:t>
+            </w:r>
+          </w:p>
+        </w:tc>
+        <w:tc>
+          <w:tcPr>
+            <w:tcW w:w="2800" w:type="dxa"/>
+          </w:tcPr>
+          <w:p>
+            <w:pPr>
+              <w:spacing w:before="20" w:after="20"/>
+              <w:jc w:val="center"/>
+            </w:pPr>
+            <w:r>
+              <w:rPr>
+                <w:b/>
+                <w:bCs/>
+                <w:sz w:val="20"/>
+                <w:szCs w:val="20"/>
+              </w:rPr>
+              <w:t xml:space="preserve">Tạp chí</w:t>
+            </w:r>
+          </w:p>
+        </w:tc>
+        <w:tc>
+          <w:tcPr>
+            <w:tcW w:w="923" w:type="dxa"/>
+          </w:tcPr>
+          <w:p>
+            <w:pPr>
+              <w:spacing w:before="20" w:after="20"/>
+              <w:jc w:val="center"/>
+            </w:pPr>
+            <w:r>
+              <w:rPr>
+                <w:b/>
+                <w:bCs/>
+                <w:sz w:val="20"/>
+                <w:szCs w:val="20"/>
+              </w:rPr>
+              <w:t xml:space="preserve">Chỉ mục</w:t>
+            </w:r>
+          </w:p>
+        </w:tc>
+        <w:tc>
+          <w:tcPr>
+            <w:tcW w:w="1819" w:type="dxa"/>
+          </w:tcPr>
+          <w:p>
+            <w:pPr>
+              <w:spacing w:before="20" w:after="20"/>
+              <w:jc w:val="center"/>
+            </w:pPr>
+            <w:r>
+              <w:rPr>
+                <w:b/>
+                <w:bCs/>
+                <w:sz w:val="20"/>
+                <w:szCs w:val="20"/>
+              </w:rPr>
+              <w:t xml:space="preserve">Tình trạng</w:t>
+            </w:r>
+          </w:p>
+        </w:tc>
+      </w:tr>
+      <w:tr>
+        <w:trPr>
+          <w:cantSplit/>
+        </w:trPr>
+        <w:tc>
+          <w:tcPr>
+            <w:tcW w:w="703" w:type="dxa"/>
+          </w:tcPr>
+          <w:p>
+            <w:pPr>
+              <w:spacing w:before="20" w:after="20"/>
+            </w:pPr>
+            <w:r>
+              <w:rPr>
+                <w:b/>
+                <w:bCs/>
+                <w:sz w:val="20"/>
+                <w:szCs w:val="20"/>
+              </w:rPr>
+              <w:t xml:space="preserve">1</w:t>
+            </w:r>
+          </w:p>
+        </w:tc>
+        <w:tc>
+          <w:tcPr>
+            <w:tcW w:w="2543" w:type="dxa"/>
+          </w:tcPr>
+          <w:p>
+            <w:pPr>
+              <w:spacing w:before="20" w:after="20"/>
+            </w:pPr>
+            <w:r>
+              <w:rPr>
+                <w:b/>
+                <w:bCs/>
+                <w:sz w:val="20"/>
+                <w:szCs w:val="20"/>
+              </w:rPr>
+              <w:t xml:space="preserve">Black-Litterman portfolio optimization using regime switching CAPM and ABC-MCMC: Empirical evidence from the Vietnamese stock market period 2019-2025</w:t>
+            </w:r>
+          </w:p>
+        </w:tc>
+        <w:tc>
+          <w:tcPr>
+            <w:tcW w:w="2800" w:type="dxa"/>
+          </w:tcPr>
+          <w:p>
+            <w:pPr>
+              <w:spacing w:before="20" w:after="20"/>
+            </w:pPr>
+            <w:r>
+              <w:rPr>
+                <w:b/>
+                <w:bCs/>
+                <w:sz w:val="20"/>
+                <w:szCs w:val="20"/>
+              </w:rPr>
+              <w:t xml:space="preserve">Journal of Policy and Development Research, tập 01, tr. 81-99, 2026, doi: 10.63640/3030-4091/jpd.apd.194</w:t>
+            </w:r>
+          </w:p>
+        </w:tc>
+        <w:tc>
+          <w:tcPr>
+            <w:tcW w:w="923" w:type="dxa"/>
+          </w:tcPr>
+          <w:p>
+            <w:pPr>
+              <w:spacing w:before="20" w:after="20"/>
+            </w:pPr>
+            <w:r>
+              <w:rPr>
+                <w:b/>
+                <w:bCs/>
+                <w:sz w:val="20"/>
+                <w:szCs w:val="20"/>
+              </w:rPr>
+              <w:t xml:space="preserve">Trong nước</w:t>
+            </w:r>
+          </w:p>
+        </w:tc>
+        <w:tc>
+          <w:tcPr>
+            <w:tcW w:w="1819" w:type="dxa"/>
+          </w:tcPr>
+          <w:p>
+            <w:pPr>
+              <w:spacing w:before="20" w:after="20"/>
+            </w:pPr>
+            <w:r>
+              <w:rPr>
+                <w:b/>
+                <w:bCs/>
+                <w:sz w:val="20"/>
+                <w:szCs w:val="20"/>
+              </w:rPr>
+              <w:t xml:space="preserve">Đã xuất bản</w:t>
+            </w:r>
+          </w:p>
+        </w:tc>
+      </w:tr>
+      <w:tr>
+        <w:trPr>
+          <w:cantSplit/>
+        </w:trPr>
+        <w:tc>
+          <w:tcPr>
+            <w:tcW w:w="703" w:type="dxa"/>
+          </w:tcPr>
+          <w:p>
+            <w:pPr>
+              <w:spacing w:before="20" w:after="20"/>
+            </w:pPr>
+            <w:r>
+              <w:rPr>
+                <w:b/>
+                <w:bCs/>
+                <w:sz w:val="20"/>
+                <w:szCs w:val="20"/>
+              </w:rPr>
+              <w:t xml:space="preserve">2</w:t>
+            </w:r>
+          </w:p>
+        </w:tc>
+        <w:tc>
+          <w:tcPr>
+            <w:tcW w:w="2543" w:type="dxa"/>
+          </w:tcPr>
+          <w:p>
+            <w:pPr>
+              <w:spacing w:before="20" w:after="20"/>
+            </w:pPr>
+            <w:r>
+              <w:rPr>
+                <w:b/>
+                <w:bCs/>
+                <w:sz w:val="20"/>
+                <w:szCs w:val="20"/>
+              </w:rPr>
+              <w:t xml:space="preserve">Tiền gửi không kỳ hạn, hiệu quả hoạt động và ổn định tài chính ngân hàng: Bằng chứng từ mô hình ngưỡng tại Việt Nam</w:t>
+            </w:r>
+          </w:p>
+        </w:tc>
+        <w:tc>
+          <w:tcPr>
+            <w:tcW w:w="2800" w:type="dxa"/>
+          </w:tcPr>
+          <w:p>
+            <w:pPr>
+              <w:spacing w:before="20" w:after="20"/>
+            </w:pPr>
+            <w:r>
+              <w:rPr>
+                <w:b/>
+                <w:bCs/>
+                <w:sz w:val="20"/>
+                <w:szCs w:val="20"/>
+              </w:rPr>
+              <w:t xml:space="preserve">Tạp chí Kinh tế - Luật và Ngân hàng, 2026, doi: 10.59276/3030-4199/jelb.bav.895</w:t>
+            </w:r>
+          </w:p>
+        </w:tc>
+        <w:tc>
+          <w:tcPr>
+            <w:tcW w:w="923" w:type="dxa"/>
+          </w:tcPr>
+          <w:p>
+            <w:pPr>
+              <w:spacing w:before="20" w:after="20"/>
+            </w:pPr>
+            <w:r>
+              <w:rPr>
+                <w:b/>
+                <w:bCs/>
+                <w:sz w:val="20"/>
+                <w:szCs w:val="20"/>
+              </w:rPr>
+              <w:t xml:space="preserve">Trong nước</w:t>
+            </w:r>
+          </w:p>
+        </w:tc>
+        <w:tc>
+          <w:tcPr>
+            <w:tcW w:w="1819" w:type="dxa"/>
+          </w:tcPr>
+          <w:p>
+            <w:pPr>
+              <w:spacing w:before="20" w:after="20"/>
+            </w:pPr>
+            <w:r>
+              <w:rPr>
+                <w:b/>
+                <w:bCs/>
+                <w:sz w:val="20"/>
+                <w:szCs w:val="20"/>
+              </w:rPr>
+              <w:t xml:space="preserve">Đã đăng</w:t>
+            </w:r>
+          </w:p>
+        </w:tc>
+      </w:tr>
+      <w:tr>
+        <w:trPr>
+          <w:cantSplit/>
+        </w:trPr>
+        <w:tc>
+          <w:tcPr>
+            <w:tcW w:w="703" w:type="dxa"/>
+          </w:tcPr>
+          <w:p>
+            <w:pPr>
+              <w:spacing w:before="20" w:after="20"/>
+            </w:pPr>
+            <w:r>
+              <w:rPr>
+                <w:b/>
+                <w:bCs/>
+                <w:sz w:val="20"/>
+                <w:szCs w:val="20"/>
+              </w:rPr>
+              <w:t xml:space="preserve">3</w:t>
+            </w:r>
+          </w:p>
+        </w:tc>
+        <w:tc>
+          <w:tcPr>
+            <w:tcW w:w="2543" w:type="dxa"/>
+          </w:tcPr>
+          <w:p>
+            <w:pPr>
+              <w:spacing w:before="20" w:after="20"/>
+            </w:pPr>
+            <w:r>
+              <w:rPr>
+                <w:b/>
+                <w:bCs/>
+                <w:sz w:val="20"/>
+                <w:szCs w:val="20"/>
+              </w:rPr>
+              <w:t xml:space="preserve">GRI adoption and corporate brownwashing: Board governance evidence from ASEAN-5</w:t>
+            </w:r>
+          </w:p>
+        </w:tc>
+        <w:tc>
+          <w:tcPr>
+            <w:tcW w:w="2800" w:type="dxa"/>
+          </w:tcPr>
+          <w:p>
+            <w:pPr>
+              <w:spacing w:before="20" w:after="20"/>
+            </w:pPr>
+            <w:r>
+              <w:rPr>
+                <w:b/>
+                <w:bCs/>
+                <w:sz w:val="20"/>
+                <w:szCs w:val="20"/>
+              </w:rPr>
+              <w:t xml:space="preserve">International Journal of Management and Sustainability</w:t>
+            </w:r>
+          </w:p>
+        </w:tc>
+        <w:tc>
+          <w:tcPr>
+            <w:tcW w:w="923" w:type="dxa"/>
+          </w:tcPr>
+          <w:p>
+            <w:pPr>
+              <w:spacing w:before="20" w:after="20"/>
+            </w:pPr>
+            <w:r>
+              <w:rPr>
+                <w:b/>
+                <w:bCs/>
+                <w:sz w:val="20"/>
+                <w:szCs w:val="20"/>
+              </w:rPr>
+              <w:t xml:space="preserve">Scopus Q3</w:t>
+            </w:r>
+          </w:p>
+        </w:tc>
+        <w:tc>
+          <w:tcPr>
+            <w:tcW w:w="1819" w:type="dxa"/>
+          </w:tcPr>
+          <w:p>
+            <w:pPr>
+              <w:spacing w:before="20" w:after="20"/>
+            </w:pPr>
+            <w:r>
+              <w:rPr>
+                <w:b/>
+                <w:bCs/>
+                <w:sz w:val="20"/>
+                <w:szCs w:val="20"/>
+              </w:rPr>
+              <w:t xml:space="preserve">Đã duyệt đăng</w:t>
+            </w:r>
+          </w:p>
+        </w:tc>
+      </w:tr>
+      <w:tr>
+        <w:trPr>
+          <w:cantSplit/>
+        </w:trPr>
+        <w:tc>
+          <w:tcPr>
+            <w:tcW w:w="703" w:type="dxa"/>
+          </w:tcPr>
+          <w:p>
+            <w:pPr>
+              <w:spacing w:before="20" w:after="20"/>
+            </w:pPr>
+            <w:r>
+              <w:rPr>
+                <w:b/>
+                <w:bCs/>
+                <w:sz w:val="20"/>
+                <w:szCs w:val="20"/>
+              </w:rPr>
+              <w:t xml:space="preserve">4</w:t>
+            </w:r>
+          </w:p>
+        </w:tc>
+        <w:tc>
+          <w:tcPr>
+            <w:tcW w:w="2543" w:type="dxa"/>
+          </w:tcPr>
+          <w:p>
+            <w:pPr>
+              <w:spacing w:before="20" w:after="20"/>
+            </w:pPr>
+            <w:r>
+              <w:rPr>
+                <w:b/>
+                <w:bCs/>
+                <w:sz w:val="20"/>
+                <w:szCs w:val="20"/>
+              </w:rPr>
+              <w:t xml:space="preserve">Portfolio optimization with the inverse Black-Litterman framework and clustering machine-learning models: Evidence from Vietnamese bank stocks</w:t>
+            </w:r>
+          </w:p>
+        </w:tc>
+        <w:tc>
+          <w:tcPr>
+            <w:tcW w:w="2800" w:type="dxa"/>
+          </w:tcPr>
+          <w:p>
+            <w:pPr>
+              <w:spacing w:before="20" w:after="20"/>
+            </w:pPr>
+            <w:r>
+              <w:rPr>
+                <w:b/>
+                <w:bCs/>
+                <w:sz w:val="20"/>
+                <w:szCs w:val="20"/>
+              </w:rPr>
+              <w:t xml:space="preserve">Multidisciplinary Science Journal</w:t>
+            </w:r>
+          </w:p>
+        </w:tc>
+        <w:tc>
+          <w:tcPr>
+            <w:tcW w:w="923" w:type="dxa"/>
+          </w:tcPr>
+          <w:p>
+            <w:pPr>
+              <w:spacing w:before="20" w:after="20"/>
+            </w:pPr>
+            <w:r>
+              <w:rPr>
+                <w:b/>
+                <w:bCs/>
+                <w:sz w:val="20"/>
+                <w:szCs w:val="20"/>
+              </w:rPr>
+              <w:t xml:space="preserve">Scopus Q3</w:t>
+            </w:r>
+          </w:p>
+        </w:tc>
+        <w:tc>
+          <w:tcPr>
+            <w:tcW w:w="1819" w:type="dxa"/>
+          </w:tcPr>
+          <w:p>
+            <w:pPr>
+              <w:spacing w:before="20" w:after="20"/>
+            </w:pPr>
+            <w:r>
+              <w:rPr>
+                <w:b/>
+                <w:bCs/>
+                <w:sz w:val="20"/>
+                <w:szCs w:val="20"/>
+              </w:rPr>
+              <w:t xml:space="preserve">Đã sửa xong vòng 2</w:t>
+            </w:r>
+          </w:p>
+        </w:tc>
+      </w:tr>
+      <w:tr>
+        <w:trPr>
+          <w:cantSplit/>
+        </w:trPr>
+        <w:tc>
+          <w:tcPr>
+            <w:tcW w:w="703" w:type="dxa"/>
+          </w:tcPr>
+          <w:p>
+            <w:pPr>
+              <w:spacing w:before="20" w:after="20"/>
+            </w:pPr>
+            <w:r>
+              <w:rPr>
+                <w:sz w:val="20"/>
+                <w:szCs w:val="20"/>
+              </w:rPr>
+              <w:t xml:space="preserve">5</w:t>
+            </w:r>
+          </w:p>
+        </w:tc>
+        <w:tc>
+          <w:tcPr>
+            <w:tcW w:w="2543" w:type="dxa"/>
+          </w:tcPr>
+          <w:p>
+            <w:pPr>
+              <w:spacing w:before="20" w:after="20"/>
+            </w:pPr>
+            <w:r>
+              <w:rPr>
+                <w:sz w:val="20"/>
+                <w:szCs w:val="20"/>
+              </w:rPr>
+              <w:t xml:space="preserve">Tác động của cấu trúc sở hữu lên ổn định tài chính của các ngân hàng thương mại Việt Nam</w:t>
+            </w:r>
+          </w:p>
+        </w:tc>
+        <w:tc>
+          <w:tcPr>
+            <w:tcW w:w="2800" w:type="dxa"/>
+          </w:tcPr>
+          <w:p>
+            <w:pPr>
+              <w:spacing w:before="20" w:after="20"/>
+            </w:pPr>
+            <w:r>
+              <w:rPr>
+                <w:sz w:val="20"/>
+                <w:szCs w:val="20"/>
+              </w:rPr>
+              <w:t xml:space="preserve">Tạp chí Kinh tế - Luật và Ngân hàng</w:t>
+            </w:r>
+          </w:p>
+        </w:tc>
+        <w:tc>
+          <w:tcPr>
+            <w:tcW w:w="923" w:type="dxa"/>
+          </w:tcPr>
+          <w:p>
+            <w:pPr>
+              <w:spacing w:before="20" w:after="20"/>
+            </w:pPr>
+            <w:r>
+              <w:rPr>
+                <w:sz w:val="20"/>
+                <w:szCs w:val="20"/>
+              </w:rPr>
+              <w:t xml:space="preserve">Trong nước</w:t>
+            </w:r>
+          </w:p>
+        </w:tc>
+        <w:tc>
+          <w:tcPr>
+            <w:tcW w:w="1819" w:type="dxa"/>
+          </w:tcPr>
+          <w:p>
+            <w:pPr>
+              <w:spacing w:before="20" w:after="20"/>
+            </w:pPr>
+            <w:r>
+              <w:rPr>
+                <w:sz w:val="20"/>
+                <w:szCs w:val="20"/>
+              </w:rPr>
+              <w:t xml:space="preserve">Chờ duyệt đăng sau 2 vòng phản biện</w:t>
+            </w:r>
+          </w:p>
+        </w:tc>
+      </w:tr>
+      <w:tr>
+        <w:trPr>
+          <w:cantSplit/>
+        </w:trPr>
+        <w:tc>
+          <w:tcPr>
+            <w:tcW w:w="703" w:type="dxa"/>
+          </w:tcPr>
+          <w:p>
+            <w:pPr>
+              <w:spacing w:before="20" w:after="20"/>
+            </w:pPr>
+            <w:r>
+              <w:rPr>
+                <w:sz w:val="20"/>
+                <w:szCs w:val="20"/>
+              </w:rPr>
+              <w:t xml:space="preserve">6</w:t>
+            </w:r>
+          </w:p>
+        </w:tc>
+        <w:tc>
+          <w:tcPr>
+            <w:tcW w:w="2543" w:type="dxa"/>
+          </w:tcPr>
+          <w:p>
+            <w:pPr>
+              <w:spacing w:before="20" w:after="20"/>
+            </w:pPr>
+            <w:r>
+              <w:rPr>
+                <w:sz w:val="20"/>
+                <w:szCs w:val="20"/>
+              </w:rPr>
+              <w:t xml:space="preserve">Limits to arbitrage in the Vietnamese physical gold market: The failure of short-term momentum</w:t>
+            </w:r>
+          </w:p>
+        </w:tc>
+        <w:tc>
+          <w:tcPr>
+            <w:tcW w:w="2800" w:type="dxa"/>
+          </w:tcPr>
+          <w:p>
+            <w:pPr>
+              <w:spacing w:before="20" w:after="20"/>
+            </w:pPr>
+            <w:r>
+              <w:rPr>
+                <w:sz w:val="20"/>
+                <w:szCs w:val="20"/>
+              </w:rPr>
+              <w:t xml:space="preserve">Journal of Economic and Banking Studies</w:t>
+            </w:r>
+          </w:p>
+        </w:tc>
+        <w:tc>
+          <w:tcPr>
+            <w:tcW w:w="923" w:type="dxa"/>
+          </w:tcPr>
+          <w:p>
+            <w:pPr>
+              <w:spacing w:before="20" w:after="20"/>
+            </w:pPr>
+            <w:r>
+              <w:rPr>
+                <w:sz w:val="20"/>
+                <w:szCs w:val="20"/>
+              </w:rPr>
+              <w:t xml:space="preserve">Trong nước</w:t>
+            </w:r>
+          </w:p>
+        </w:tc>
+        <w:tc>
+          <w:tcPr>
+            <w:tcW w:w="1819" w:type="dxa"/>
+          </w:tcPr>
+          <w:p>
+            <w:pPr>
+              <w:spacing w:before="20" w:after="20"/>
+            </w:pPr>
+            <w:r>
+              <w:rPr>
+                <w:sz w:val="20"/>
+                <w:szCs w:val="20"/>
+              </w:rPr>
+              <w:t xml:space="preserve">Đang sửa vòng 1</w:t>
+            </w:r>
+          </w:p>
+        </w:tc>
+      </w:tr>
+      <w:tr>
+        <w:trPr>
+          <w:cantSplit/>
+        </w:trPr>
+        <w:tc>
+          <w:tcPr>
+            <w:tcW w:w="703" w:type="dxa"/>
+          </w:tcPr>
+          <w:p>
+            <w:pPr>
+              <w:spacing w:before="20" w:after="20"/>
+            </w:pPr>
+            <w:r>
+              <w:rPr>
+                <w:sz w:val="20"/>
+                <w:szCs w:val="20"/>
+              </w:rPr>
+              <w:t xml:space="preserve">7</w:t>
+            </w:r>
+          </w:p>
+        </w:tc>
+        <w:tc>
+          <w:tcPr>
+            <w:tcW w:w="2543" w:type="dxa"/>
+          </w:tcPr>
+          <w:p>
+            <w:pPr>
+              <w:spacing w:before="20" w:after="20"/>
+            </w:pPr>
+            <w:r>
+              <w:rPr>
+                <w:sz w:val="20"/>
+                <w:szCs w:val="20"/>
+              </w:rPr>
+              <w:t xml:space="preserve">Corporate brownwashing and firm valuation in ASEAN-5 disclosure regimes</w:t>
+            </w:r>
+          </w:p>
+        </w:tc>
+        <w:tc>
+          <w:tcPr>
+            <w:tcW w:w="2800" w:type="dxa"/>
+          </w:tcPr>
+          <w:p>
+            <w:pPr>
+              <w:spacing w:before="20" w:after="20"/>
+            </w:pPr>
+            <w:r>
+              <w:rPr>
+                <w:sz w:val="20"/>
+                <w:szCs w:val="20"/>
+              </w:rPr>
+              <w:t xml:space="preserve">Cogent Business &amp; Management</w:t>
+            </w:r>
+          </w:p>
+        </w:tc>
+        <w:tc>
+          <w:tcPr>
+            <w:tcW w:w="923" w:type="dxa"/>
+          </w:tcPr>
+          <w:p>
+            <w:pPr>
+              <w:spacing w:before="20" w:after="20"/>
+            </w:pPr>
+            <w:r>
+              <w:rPr>
+                <w:sz w:val="20"/>
+                <w:szCs w:val="20"/>
+              </w:rPr>
+              <w:t xml:space="preserve">ESCI, Scopus Q2</w:t>
+            </w:r>
+          </w:p>
+        </w:tc>
+        <w:tc>
+          <w:tcPr>
+            <w:tcW w:w="1819" w:type="dxa"/>
+          </w:tcPr>
+          <w:p>
+            <w:pPr>
+              <w:spacing w:before="20" w:after="20"/>
+            </w:pPr>
+            <w:r>
+              <w:rPr>
+                <w:sz w:val="20"/>
+                <w:szCs w:val="20"/>
+              </w:rPr>
+              <w:t xml:space="preserve">Đang phản biện vòng 1</w:t>
+            </w:r>
+          </w:p>
+        </w:tc>
+      </w:tr>
+      <w:tr>
+        <w:trPr>
+          <w:cantSplit/>
+        </w:trPr>
+        <w:tc>
+          <w:tcPr>
+            <w:tcW w:w="703" w:type="dxa"/>
+          </w:tcPr>
+          <w:p>
+            <w:pPr>
+              <w:spacing w:before="20" w:after="20"/>
+            </w:pPr>
+            <w:r>
+              <w:rPr>
+                <w:sz w:val="20"/>
+                <w:szCs w:val="20"/>
+              </w:rPr>
+              <w:t xml:space="preserve">8</w:t>
+            </w:r>
+          </w:p>
+        </w:tc>
+        <w:tc>
+          <w:tcPr>
+            <w:tcW w:w="2543" w:type="dxa"/>
+          </w:tcPr>
+          <w:p>
+            <w:pPr>
+              <w:spacing w:before="20" w:after="20"/>
+            </w:pPr>
+            <w:r>
+              <w:rPr>
+                <w:sz w:val="20"/>
+                <w:szCs w:val="20"/>
+              </w:rPr>
+              <w:t xml:space="preserve">Structural breaks in Vietnamese stock market liquidity: Evidence from the Amihud illiquidity measure and Bai-Perron regime-shift detection</w:t>
+            </w:r>
+          </w:p>
+        </w:tc>
+        <w:tc>
+          <w:tcPr>
+            <w:tcW w:w="2800" w:type="dxa"/>
+          </w:tcPr>
+          <w:p>
+            <w:pPr>
+              <w:spacing w:before="20" w:after="20"/>
+            </w:pPr>
+            <w:r>
+              <w:rPr>
+                <w:sz w:val="20"/>
+                <w:szCs w:val="20"/>
+              </w:rPr>
+              <w:t xml:space="preserve">Asian Journal of Economics and Banking</w:t>
+            </w:r>
+          </w:p>
+        </w:tc>
+        <w:tc>
+          <w:tcPr>
+            <w:tcW w:w="923" w:type="dxa"/>
+          </w:tcPr>
+          <w:p>
+            <w:pPr>
+              <w:spacing w:before="20" w:after="20"/>
+            </w:pPr>
+            <w:r>
+              <w:rPr>
+                <w:sz w:val="20"/>
+                <w:szCs w:val="20"/>
+              </w:rPr>
+              <w:t xml:space="preserve">Chưa xác định</w:t>
+            </w:r>
+          </w:p>
+        </w:tc>
+        <w:tc>
+          <w:tcPr>
+            <w:tcW w:w="1819" w:type="dxa"/>
+          </w:tcPr>
+          <w:p>
+            <w:pPr>
+              <w:spacing w:before="20" w:after="20"/>
+            </w:pPr>
+            <w:r>
+              <w:rPr>
+                <w:sz w:val="20"/>
+                <w:szCs w:val="20"/>
+              </w:rPr>
+              <w:t xml:space="preserve">Đang tìm phản biện</w:t>
+            </w:r>
+          </w:p>
+        </w:tc>
+      </w:tr>
+      <w:tr>
+        <w:trPr>
+          <w:cantSplit/>
+        </w:trPr>
+        <w:tc>
+          <w:tcPr>
+            <w:tcW w:w="703" w:type="dxa"/>
+          </w:tcPr>
+          <w:p>
+            <w:pPr>
+              <w:spacing w:before="20" w:after="20"/>
+            </w:pPr>
+            <w:r>
+              <w:rPr>
+                <w:sz w:val="20"/>
+                <w:szCs w:val="20"/>
+              </w:rPr>
+              <w:t xml:space="preserve">9</w:t>
+            </w:r>
+          </w:p>
+        </w:tc>
+        <w:tc>
+          <w:tcPr>
+            <w:tcW w:w="2543" w:type="dxa"/>
+          </w:tcPr>
+          <w:p>
+            <w:pPr>
+              <w:spacing w:before="20" w:after="20"/>
+            </w:pPr>
+            <w:r>
+              <w:rPr>
+                <w:sz w:val="20"/>
+                <w:szCs w:val="20"/>
+              </w:rPr>
+              <w:t xml:space="preserve">Nested equity index correlations overstate true co-movement: Evidence from Vietnam</w:t>
+            </w:r>
+          </w:p>
+        </w:tc>
+        <w:tc>
+          <w:tcPr>
+            <w:tcW w:w="2800" w:type="dxa"/>
+          </w:tcPr>
+          <w:p>
+            <w:pPr>
+              <w:spacing w:before="20" w:after="20"/>
+            </w:pPr>
+            <w:r>
+              <w:rPr>
+                <w:sz w:val="20"/>
+                <w:szCs w:val="20"/>
+              </w:rPr>
+              <w:t xml:space="preserve">Asia-Pacific Financial Markets</w:t>
+            </w:r>
+          </w:p>
+        </w:tc>
+        <w:tc>
+          <w:tcPr>
+            <w:tcW w:w="923" w:type="dxa"/>
+          </w:tcPr>
+          <w:p>
+            <w:pPr>
+              <w:spacing w:before="20" w:after="20"/>
+            </w:pPr>
+            <w:r>
+              <w:rPr>
+                <w:sz w:val="20"/>
+                <w:szCs w:val="20"/>
+              </w:rPr>
+              <w:t xml:space="preserve">Scopus Q2</w:t>
+            </w:r>
+          </w:p>
+        </w:tc>
+        <w:tc>
+          <w:tcPr>
+            <w:tcW w:w="1819" w:type="dxa"/>
+          </w:tcPr>
+          <w:p>
+            <w:pPr>
+              <w:spacing w:before="20" w:after="20"/>
+            </w:pPr>
+            <w:r>
+              <w:rPr>
+                <w:sz w:val="20"/>
+                <w:szCs w:val="20"/>
+              </w:rPr>
+              <w:t xml:space="preserve">With Editor</w:t>
+            </w:r>
+          </w:p>
+        </w:tc>
+      </w:tr>
+      <w:tr>
+        <w:trPr>
+          <w:cantSplit/>
+        </w:trPr>
+        <w:tc>
+          <w:tcPr>
+            <w:tcW w:w="703" w:type="dxa"/>
+          </w:tcPr>
+          <w:p>
+            <w:pPr>
+              <w:spacing w:before="20" w:after="20"/>
+            </w:pPr>
+            <w:r>
+              <w:rPr>
+                <w:sz w:val="20"/>
+                <w:szCs w:val="20"/>
+              </w:rPr>
+              <w:t xml:space="preserve">10</w:t>
+            </w:r>
+          </w:p>
+        </w:tc>
+        <w:tc>
+          <w:tcPr>
+            <w:tcW w:w="2543" w:type="dxa"/>
+          </w:tcPr>
+          <w:p>
+            <w:pPr>
+              <w:spacing w:before="20" w:after="20"/>
+            </w:pPr>
+            <w:r>
+              <w:rPr>
+                <w:sz w:val="20"/>
+                <w:szCs w:val="20"/>
+              </w:rPr>
+              <w:t xml:space="preserve">Who gains from a market upgrade? Stock liquidity and prices around Vietnam's FTSE Russell reclassification</w:t>
+            </w:r>
+          </w:p>
+        </w:tc>
+        <w:tc>
+          <w:tcPr>
+            <w:tcW w:w="2800" w:type="dxa"/>
+          </w:tcPr>
+          <w:p>
+            <w:pPr>
+              <w:spacing w:before="20" w:after="20"/>
+            </w:pPr>
+            <w:r>
+              <w:rPr>
+                <w:sz w:val="20"/>
+                <w:szCs w:val="20"/>
+              </w:rPr>
+              <w:t xml:space="preserve">Finance Research Open</w:t>
+            </w:r>
+          </w:p>
+        </w:tc>
+        <w:tc>
+          <w:tcPr>
+            <w:tcW w:w="923" w:type="dxa"/>
+          </w:tcPr>
+          <w:p>
+            <w:pPr>
+              <w:spacing w:before="20" w:after="20"/>
+            </w:pPr>
+            <w:r>
+              <w:rPr>
+                <w:sz w:val="20"/>
+                <w:szCs w:val="20"/>
+              </w:rPr>
+              <w:t xml:space="preserve">Chưa xác định</w:t>
+            </w:r>
+          </w:p>
+        </w:tc>
+        <w:tc>
+          <w:tcPr>
+            <w:tcW w:w="1819" w:type="dxa"/>
+          </w:tcPr>
+          <w:p>
+            <w:pPr>
+              <w:spacing w:before="20" w:after="20"/>
+            </w:pPr>
+            <w:r>
+              <w:rPr>
+                <w:sz w:val="20"/>
+                <w:szCs w:val="20"/>
+              </w:rPr>
+              <w:t xml:space="preserve">With Editor</w:t>
+            </w:r>
+          </w:p>
+        </w:tc>
+      </w:tr>
+      <w:tr>
+        <w:trPr>
+          <w:cantSplit/>
+        </w:trPr>
+        <w:tc>
+          <w:tcPr>
+            <w:tcW w:w="703" w:type="dxa"/>
+          </w:tcPr>
+          <w:p>
+            <w:pPr>
+              <w:spacing w:before="20" w:after="20"/>
+            </w:pPr>
+            <w:r>
+              <w:rPr>
+                <w:sz w:val="20"/>
+                <w:szCs w:val="20"/>
+              </w:rPr>
+              <w:t xml:space="preserve">11</w:t>
+            </w:r>
+          </w:p>
+        </w:tc>
+        <w:tc>
+          <w:tcPr>
+            <w:tcW w:w="2543" w:type="dxa"/>
+          </w:tcPr>
+          <w:p>
+            <w:pPr>
+              <w:spacing w:before="20" w:after="20"/>
+            </w:pPr>
+            <w:r>
+              <w:rPr>
+                <w:sz w:val="20"/>
+                <w:szCs w:val="20"/>
+              </w:rPr>
+              <w:t xml:space="preserve">Rated at the peak? Firm valuation around the first LSEG ESG score in five Southeast Asian markets</w:t>
+            </w:r>
+          </w:p>
+        </w:tc>
+        <w:tc>
+          <w:tcPr>
+            <w:tcW w:w="2800" w:type="dxa"/>
+          </w:tcPr>
+          <w:p>
+            <w:pPr>
+              <w:spacing w:before="20" w:after="20"/>
+            </w:pPr>
+            <w:r>
+              <w:rPr>
+                <w:sz w:val="20"/>
+                <w:szCs w:val="20"/>
+              </w:rPr>
+              <w:t xml:space="preserve">Accounting Open</w:t>
+            </w:r>
+          </w:p>
+        </w:tc>
+        <w:tc>
+          <w:tcPr>
+            <w:tcW w:w="923" w:type="dxa"/>
+          </w:tcPr>
+          <w:p>
+            <w:pPr>
+              <w:spacing w:before="20" w:after="20"/>
+            </w:pPr>
+            <w:r>
+              <w:rPr>
+                <w:sz w:val="20"/>
+                <w:szCs w:val="20"/>
+              </w:rPr>
+              <w:t xml:space="preserve">Chưa xác định</w:t>
+            </w:r>
+          </w:p>
+        </w:tc>
+        <w:tc>
+          <w:tcPr>
+            <w:tcW w:w="1819" w:type="dxa"/>
+          </w:tcPr>
+          <w:p>
+            <w:pPr>
+              <w:spacing w:before="20" w:after="20"/>
+            </w:pPr>
+            <w:r>
+              <w:rPr>
+                <w:sz w:val="20"/>
+                <w:szCs w:val="20"/>
+              </w:rPr>
+              <w:t xml:space="preserve">With Editor</w:t>
+            </w:r>
+          </w:p>
+        </w:tc>
+      </w:tr>
+      <w:tr>
+        <w:trPr>
+          <w:cantSplit/>
+        </w:trPr>
+        <w:tc>
+          <w:tcPr>
+            <w:tcW w:w="703" w:type="dxa"/>
+          </w:tcPr>
+          <w:p>
+            <w:pPr>
+              <w:spacing w:before="20" w:after="20"/>
+            </w:pPr>
+            <w:r>
+              <w:rPr>
+                <w:sz w:val="20"/>
+                <w:szCs w:val="20"/>
+              </w:rPr>
+              <w:t xml:space="preserve">12</w:t>
+            </w:r>
+          </w:p>
+        </w:tc>
+        <w:tc>
+          <w:tcPr>
+            <w:tcW w:w="2543" w:type="dxa"/>
+          </w:tcPr>
+          <w:p>
+            <w:pPr>
+              <w:spacing w:before="20" w:after="20"/>
+            </w:pPr>
+            <w:r>
+              <w:rPr>
+                <w:sz w:val="20"/>
+                <w:szCs w:val="20"/>
+              </w:rPr>
+              <w:t xml:space="preserve">Sales-based real earnings management and the cost of debt: Evidence from five ASEAN markets</w:t>
+            </w:r>
+          </w:p>
+        </w:tc>
+        <w:tc>
+          <w:tcPr>
+            <w:tcW w:w="2800" w:type="dxa"/>
+          </w:tcPr>
+          <w:p>
+            <w:pPr>
+              <w:spacing w:before="20" w:after="20"/>
+            </w:pPr>
+            <w:r>
+              <w:rPr>
+                <w:sz w:val="20"/>
+                <w:szCs w:val="20"/>
+              </w:rPr>
+              <w:t xml:space="preserve">Accounting Open</w:t>
+            </w:r>
+          </w:p>
+        </w:tc>
+        <w:tc>
+          <w:tcPr>
+            <w:tcW w:w="923" w:type="dxa"/>
+          </w:tcPr>
+          <w:p>
+            <w:pPr>
+              <w:spacing w:before="20" w:after="20"/>
+            </w:pPr>
+            <w:r>
+              <w:rPr>
+                <w:sz w:val="20"/>
+                <w:szCs w:val="20"/>
+              </w:rPr>
+              <w:t xml:space="preserve">Chưa xác định</w:t>
+            </w:r>
+          </w:p>
+        </w:tc>
+        <w:tc>
+          <w:tcPr>
+            <w:tcW w:w="1819" w:type="dxa"/>
+          </w:tcPr>
+          <w:p>
+            <w:pPr>
+              <w:spacing w:before="20" w:after="20"/>
+            </w:pPr>
+            <w:r>
+              <w:rPr>
+                <w:sz w:val="20"/>
+                <w:szCs w:val="20"/>
+              </w:rPr>
+              <w:t xml:space="preserve">With Editor</w:t>
+            </w:r>
+          </w:p>
+        </w:tc>
+      </w:tr>
+    </w:tbl>
+    <w:p>
+      <w:pPr>
+        <w:spacing w:after="60"/>
+      </w:pPr>
+    </w:p>
+    <w:p>
+      <w:pPr>
+        <w:pStyle w:val="Content"/>
+        <w:spacing w:after="120"/>
+        <w:ind w:firstLine="567"/>
+        <w:jc w:val="both"/>
+      </w:pPr>
+      <w:r>
+        <w:t xml:space="preserve">Bài số 1 và bài số 4 gần với đề tài thực tập nhất: bài số 1 áp dụng Black-Litterman trên thị trường cổ phiếu Việt Nam [23], bài số 4 mở rộng sang khung Black-Litterman nghịch đảo kết hợp học máy phân cụm. BL Advisor đưa ý tưởng phân bổ ấy vào một công cụ cho người dùng cuối. Các bài còn lại thuộc mảng thị trường vốn, ngân hàng và kế toán, không liên quan đến mã nguồn của dự án.</w:t>
       </w:r>
     </w:p>
     <w:p>

</xml_diff>